<commit_message>
Actividad Evaluable DIW Terminada
</commit_message>
<xml_diff>
--- a/DIW/UT2/Ejercicios/Actividad de Evaluacion 2/González_García_Pablo_TEMA_02_AE_02.docx
+++ b/DIW/UT2/Ejercicios/Actividad de Evaluacion 2/González_García_Pablo_TEMA_02_AE_02.docx
@@ -60,23 +60,7 @@
     </w:p>
     <w:p>
       <w:r>
-        <w:t>En esta primera parte se han colocado seis encabezados (h1–h6). Dentro de cada uno se ha añadido un texto secundario utilizando la etiqueta &lt;</w:t>
-      </w:r>
-      <w:proofErr w:type="spellStart"/>
-      <w:r>
-        <w:t>small</w:t>
-      </w:r>
-      <w:proofErr w:type="spellEnd"/>
-      <w:r>
-        <w:t xml:space="preserve">&gt; con la clase </w:t>
-      </w:r>
-      <w:proofErr w:type="spellStart"/>
-      <w:r>
-        <w:t>text-muted</w:t>
-      </w:r>
-      <w:proofErr w:type="spellEnd"/>
-      <w:r>
-        <w:t>, lo que hace que aparezca más pequeño y atenuado.</w:t>
+        <w:t>En esta primera parte se han colocado seis encabezados (h1–h6). Dentro de cada uno se ha añadido un texto secundario utilizando la etiqueta &lt;small&gt; con la clase text-muted, lo que hace que aparezca más pequeño y atenuado.</w:t>
       </w:r>
     </w:p>
     <w:p>
@@ -88,6 +72,7 @@
       <w:r>
         <w:rPr>
           <w:rFonts w:ascii="Segoe UI Emoji" w:hAnsi="Segoe UI Emoji" w:cs="Segoe UI Emoji"/>
+          <w:noProof/>
         </w:rPr>
         <w:drawing>
           <wp:inline distT="0" distB="0" distL="0" distR="0" wp14:anchorId="16E1A635" wp14:editId="4590D880">
@@ -143,6 +128,7 @@
       <w:r>
         <w:rPr>
           <w:rFonts w:ascii="Segoe UI Emoji" w:hAnsi="Segoe UI Emoji" w:cs="Segoe UI Emoji"/>
+          <w:noProof/>
         </w:rPr>
         <w:lastRenderedPageBreak/>
         <w:drawing>
@@ -182,13 +168,8 @@
         </w:drawing>
       </w:r>
       <w:r>
-        <w:t xml:space="preserve">3. Encabezados con clases </w:t>
-      </w:r>
-      <w:proofErr w:type="spellStart"/>
-      <w:r>
-        <w:t>display</w:t>
-      </w:r>
-      <w:proofErr w:type="spellEnd"/>
+        <w:t>3. Encabezados con clases display</w:t>
+      </w:r>
     </w:p>
     <w:p>
       <w:r>
@@ -197,18 +178,14 @@
     </w:p>
     <w:p>
       <w:r>
-        <w:t xml:space="preserve">Captura 3 – Encabezados </w:t>
-      </w:r>
-      <w:proofErr w:type="spellStart"/>
-      <w:r>
-        <w:t>display</w:t>
-      </w:r>
-      <w:proofErr w:type="spellEnd"/>
+        <w:t>Captura 3 – Encabezados display</w:t>
+      </w:r>
     </w:p>
     <w:p>
       <w:r>
         <w:rPr>
           <w:rFonts w:ascii="Segoe UI Emoji" w:hAnsi="Segoe UI Emoji" w:cs="Segoe UI Emoji"/>
+          <w:noProof/>
         </w:rPr>
         <w:drawing>
           <wp:inline distT="0" distB="0" distL="0" distR="0" wp14:anchorId="6E51D436" wp14:editId="11C15CED">
@@ -252,15 +229,7 @@
     </w:p>
     <w:p>
       <w:r>
-        <w:t xml:space="preserve">En la cuarta fila se han colocado dos párrafos iguales. A uno de ellos se le ha aplicado la </w:t>
-      </w:r>
-      <w:proofErr w:type="gramStart"/>
-      <w:r>
-        <w:t>clase .lead</w:t>
-      </w:r>
-      <w:proofErr w:type="gramEnd"/>
-      <w:r>
-        <w:t>, que aumenta el tamaño y el interlineado para destacar el texto.</w:t>
+        <w:t>En la cuarta fila se han colocado dos párrafos iguales. A uno de ellos se le ha aplicado la clase .lead, que aumenta el tamaño y el interlineado para destacar el texto.</w:t>
       </w:r>
     </w:p>
     <w:p>
@@ -279,6 +248,7 @@
       <w:r>
         <w:rPr>
           <w:rFonts w:ascii="Segoe UI Emoji" w:hAnsi="Segoe UI Emoji" w:cs="Segoe UI Emoji"/>
+          <w:noProof/>
         </w:rPr>
         <w:lastRenderedPageBreak/>
         <w:drawing>
@@ -355,6 +325,7 @@
       <w:r>
         <w:rPr>
           <w:rFonts w:ascii="Aptos Black" w:hAnsi="Aptos Black"/>
+          <w:noProof/>
           <w:sz w:val="30"/>
           <w:szCs w:val="30"/>
         </w:rPr>
@@ -430,39 +401,52 @@
     <w:p>
       <w:r>
         <w:rPr>
-          <w:rFonts w:ascii="Segoe UI Emoji" w:hAnsi="Segoe UI Emoji" w:cs="Segoe UI Emoji"/>
+          <w:noProof/>
         </w:rPr>
         <w:lastRenderedPageBreak/>
-        <w:t>👉</w:t>
-      </w:r>
-      <w:r>
-        <w:t xml:space="preserve"> Inserta aquí la captura de la primera fila.</w:t>
-      </w:r>
-    </w:p>
-    <w:p>
-      <w:r>
-        <w:t xml:space="preserve">2. Imagen 800×800 con clase </w:t>
-      </w:r>
-      <w:proofErr w:type="spellStart"/>
-      <w:r>
-        <w:t>img</w:t>
-      </w:r>
-      <w:proofErr w:type="spellEnd"/>
-      <w:r>
-        <w:t>-fluid</w:t>
-      </w:r>
-    </w:p>
-    <w:p>
-      <w:r>
-        <w:t xml:space="preserve">En la segunda fila se ha colocado una imagen de 800×800 con la clase </w:t>
-      </w:r>
-      <w:proofErr w:type="spellStart"/>
-      <w:r>
-        <w:t>img</w:t>
-      </w:r>
-      <w:proofErr w:type="spellEnd"/>
-      <w:r>
-        <w:t>-fluid, que permite que se adapte al ancho del contenedor manteniendo su proporción.</w:t>
+        <w:drawing>
+          <wp:inline distT="0" distB="0" distL="0" distR="0" wp14:anchorId="624E0D90" wp14:editId="3D0BA141">
+            <wp:extent cx="5400040" cy="1640205"/>
+            <wp:effectExtent l="0" t="0" r="0" b="0"/>
+            <wp:docPr id="993425004" name="Imagen 1" descr="Forma&#10;&#10;El contenido generado por IA puede ser incorrecto."/>
+            <wp:cNvGraphicFramePr>
+              <a:graphicFrameLocks xmlns:a="http://schemas.openxmlformats.org/drawingml/2006/main" noChangeAspect="1"/>
+            </wp:cNvGraphicFramePr>
+            <a:graphic xmlns:a="http://schemas.openxmlformats.org/drawingml/2006/main">
+              <a:graphicData uri="http://schemas.openxmlformats.org/drawingml/2006/picture">
+                <pic:pic xmlns:pic="http://schemas.openxmlformats.org/drawingml/2006/picture">
+                  <pic:nvPicPr>
+                    <pic:cNvPr id="993425004" name="Imagen 1" descr="Forma&#10;&#10;El contenido generado por IA puede ser incorrecto."/>
+                    <pic:cNvPicPr/>
+                  </pic:nvPicPr>
+                  <pic:blipFill>
+                    <a:blip r:embed="rId12"/>
+                    <a:stretch>
+                      <a:fillRect/>
+                    </a:stretch>
+                  </pic:blipFill>
+                  <pic:spPr>
+                    <a:xfrm>
+                      <a:off x="0" y="0"/>
+                      <a:ext cx="5400040" cy="1640205"/>
+                    </a:xfrm>
+                    <a:prstGeom prst="rect">
+                      <a:avLst/>
+                    </a:prstGeom>
+                  </pic:spPr>
+                </pic:pic>
+              </a:graphicData>
+            </a:graphic>
+          </wp:inline>
+        </w:drawing>
+      </w:r>
+      <w:r>
+        <w:t>2. Imagen 800×800 con clase img-fluid</w:t>
+      </w:r>
+    </w:p>
+    <w:p>
+      <w:r>
+        <w:t>En la segunda fila se ha colocado una imagen de 800×800 con la clase img-fluid, que permite que se adapte al ancho del contenedor manteniendo su proporción.</w:t>
       </w:r>
     </w:p>
     <w:p>
@@ -473,15 +457,44 @@
     <w:p>
       <w:r>
         <w:rPr>
-          <w:rFonts w:ascii="Segoe UI Emoji" w:hAnsi="Segoe UI Emoji" w:cs="Segoe UI Emoji"/>
+          <w:noProof/>
         </w:rPr>
-        <w:t>👉</w:t>
-      </w:r>
-      <w:r>
-        <w:t xml:space="preserve"> Inserta aquí la captura de la segunda fila.</w:t>
-      </w:r>
-    </w:p>
-    <w:p>
+        <w:drawing>
+          <wp:inline distT="0" distB="0" distL="0" distR="0" wp14:anchorId="7D46E409" wp14:editId="5000450A">
+            <wp:extent cx="4648200" cy="4286250"/>
+            <wp:effectExtent l="0" t="0" r="0" b="0"/>
+            <wp:docPr id="20101192" name="Imagen 1" descr="Imagen que contiene pasto, exterior, azul, parado&#10;&#10;El contenido generado por IA puede ser incorrecto."/>
+            <wp:cNvGraphicFramePr>
+              <a:graphicFrameLocks xmlns:a="http://schemas.openxmlformats.org/drawingml/2006/main" noChangeAspect="1"/>
+            </wp:cNvGraphicFramePr>
+            <a:graphic xmlns:a="http://schemas.openxmlformats.org/drawingml/2006/main">
+              <a:graphicData uri="http://schemas.openxmlformats.org/drawingml/2006/picture">
+                <pic:pic xmlns:pic="http://schemas.openxmlformats.org/drawingml/2006/picture">
+                  <pic:nvPicPr>
+                    <pic:cNvPr id="20101192" name="Imagen 1" descr="Imagen que contiene pasto, exterior, azul, parado&#10;&#10;El contenido generado por IA puede ser incorrecto."/>
+                    <pic:cNvPicPr/>
+                  </pic:nvPicPr>
+                  <pic:blipFill>
+                    <a:blip r:embed="rId13"/>
+                    <a:stretch>
+                      <a:fillRect/>
+                    </a:stretch>
+                  </pic:blipFill>
+                  <pic:spPr>
+                    <a:xfrm>
+                      <a:off x="0" y="0"/>
+                      <a:ext cx="4648200" cy="4286250"/>
+                    </a:xfrm>
+                    <a:prstGeom prst="rect">
+                      <a:avLst/>
+                    </a:prstGeom>
+                  </pic:spPr>
+                </pic:pic>
+              </a:graphicData>
+            </a:graphic>
+          </wp:inline>
+        </w:drawing>
+      </w:r>
       <w:r>
         <w:t>3. Dos imágenes flotadas</w:t>
       </w:r>
@@ -493,51 +506,65 @@
     </w:p>
     <w:p>
       <w:r>
-        <w:t xml:space="preserve">Una con </w:t>
-      </w:r>
-      <w:proofErr w:type="spellStart"/>
-      <w:r>
-        <w:t>float-left</w:t>
-      </w:r>
-      <w:proofErr w:type="spellEnd"/>
-    </w:p>
-    <w:p>
-      <w:r>
-        <w:t xml:space="preserve">Otra con </w:t>
-      </w:r>
-      <w:proofErr w:type="spellStart"/>
-      <w:r>
-        <w:t>float-right</w:t>
-      </w:r>
-      <w:proofErr w:type="spellEnd"/>
-    </w:p>
-    <w:p>
-      <w:r>
-        <w:t xml:space="preserve">Ambas con </w:t>
-      </w:r>
-      <w:proofErr w:type="spellStart"/>
-      <w:r>
-        <w:t>img</w:t>
-      </w:r>
-      <w:proofErr w:type="spellEnd"/>
-      <w:r>
-        <w:t>-fluid.</w:t>
-      </w:r>
-    </w:p>
-    <w:p>
-      <w:r>
+        <w:t>Una con float-left</w:t>
+      </w:r>
+    </w:p>
+    <w:p>
+      <w:r>
+        <w:t>Otra con float-right</w:t>
+      </w:r>
+    </w:p>
+    <w:p>
+      <w:r>
+        <w:t>Ambas con img-fluid.</w:t>
+      </w:r>
+    </w:p>
+    <w:p>
+      <w:r>
+        <w:lastRenderedPageBreak/>
         <w:t>Captura 7 – Imágenes flotadas izquierda/derecha</w:t>
       </w:r>
     </w:p>
     <w:p>
       <w:r>
         <w:rPr>
-          <w:rFonts w:ascii="Segoe UI Emoji" w:hAnsi="Segoe UI Emoji" w:cs="Segoe UI Emoji"/>
+          <w:noProof/>
         </w:rPr>
-        <w:t>👉</w:t>
-      </w:r>
-      <w:r>
-        <w:t xml:space="preserve"> Inserta aquí la captura de la tercera fila.</w:t>
+        <w:drawing>
+          <wp:inline distT="0" distB="0" distL="0" distR="0" wp14:anchorId="60293079" wp14:editId="1011CFEF">
+            <wp:extent cx="4343400" cy="5067300"/>
+            <wp:effectExtent l="0" t="0" r="0" b="0"/>
+            <wp:docPr id="2049637993" name="Imagen 1" descr="Imagen en blanco y negro&#10;&#10;El contenido generado por IA puede ser incorrecto."/>
+            <wp:cNvGraphicFramePr>
+              <a:graphicFrameLocks xmlns:a="http://schemas.openxmlformats.org/drawingml/2006/main" noChangeAspect="1"/>
+            </wp:cNvGraphicFramePr>
+            <a:graphic xmlns:a="http://schemas.openxmlformats.org/drawingml/2006/main">
+              <a:graphicData uri="http://schemas.openxmlformats.org/drawingml/2006/picture">
+                <pic:pic xmlns:pic="http://schemas.openxmlformats.org/drawingml/2006/picture">
+                  <pic:nvPicPr>
+                    <pic:cNvPr id="2049637993" name="Imagen 1" descr="Imagen en blanco y negro&#10;&#10;El contenido generado por IA puede ser incorrecto."/>
+                    <pic:cNvPicPr/>
+                  </pic:nvPicPr>
+                  <pic:blipFill>
+                    <a:blip r:embed="rId14"/>
+                    <a:stretch>
+                      <a:fillRect/>
+                    </a:stretch>
+                  </pic:blipFill>
+                  <pic:spPr>
+                    <a:xfrm>
+                      <a:off x="0" y="0"/>
+                      <a:ext cx="4343400" cy="5067300"/>
+                    </a:xfrm>
+                    <a:prstGeom prst="rect">
+                      <a:avLst/>
+                    </a:prstGeom>
+                  </pic:spPr>
+                </pic:pic>
+              </a:graphicData>
+            </a:graphic>
+          </wp:inline>
+        </w:drawing>
       </w:r>
     </w:p>
     <w:p>
@@ -551,23 +578,13 @@
       </w:r>
     </w:p>
     <w:p>
-      <w:proofErr w:type="spellStart"/>
-      <w:r>
-        <w:t>rounded</w:t>
-      </w:r>
-      <w:proofErr w:type="spellEnd"/>
-      <w:r>
-        <w:t xml:space="preserve"> a la primera</w:t>
-      </w:r>
-    </w:p>
-    <w:p>
-      <w:proofErr w:type="spellStart"/>
-      <w:r>
-        <w:t>border</w:t>
-      </w:r>
-      <w:proofErr w:type="spellEnd"/>
-      <w:r>
-        <w:t xml:space="preserve"> a la segunda</w:t>
+      <w:r>
+        <w:t>rounded a la primera</w:t>
+      </w:r>
+    </w:p>
+    <w:p>
+      <w:r>
+        <w:t>border a la segunda</w:t>
       </w:r>
     </w:p>
     <w:p>
@@ -578,23 +595,48 @@
     <w:p>
       <w:r>
         <w:rPr>
-          <w:rFonts w:ascii="Segoe UI Emoji" w:hAnsi="Segoe UI Emoji" w:cs="Segoe UI Emoji"/>
+          <w:noProof/>
         </w:rPr>
-        <w:t>👉</w:t>
-      </w:r>
-      <w:r>
-        <w:t xml:space="preserve"> Inserta aquí la captura de la cuarta fila.</w:t>
-      </w:r>
-    </w:p>
-    <w:p>
-      <w:r>
-        <w:t xml:space="preserve">5. Figura con </w:t>
-      </w:r>
-      <w:proofErr w:type="spellStart"/>
-      <w:r>
-        <w:t>caption</w:t>
-      </w:r>
-      <w:proofErr w:type="spellEnd"/>
+        <w:lastRenderedPageBreak/>
+        <w:drawing>
+          <wp:inline distT="0" distB="0" distL="0" distR="0" wp14:anchorId="39A03E9C" wp14:editId="62C288C0">
+            <wp:extent cx="5400040" cy="5066665"/>
+            <wp:effectExtent l="0" t="0" r="0" b="635"/>
+            <wp:docPr id="1122397012" name="Imagen 1" descr="Calle de ciudad con edificios altos&#10;&#10;El contenido generado por IA puede ser incorrecto."/>
+            <wp:cNvGraphicFramePr>
+              <a:graphicFrameLocks xmlns:a="http://schemas.openxmlformats.org/drawingml/2006/main" noChangeAspect="1"/>
+            </wp:cNvGraphicFramePr>
+            <a:graphic xmlns:a="http://schemas.openxmlformats.org/drawingml/2006/main">
+              <a:graphicData uri="http://schemas.openxmlformats.org/drawingml/2006/picture">
+                <pic:pic xmlns:pic="http://schemas.openxmlformats.org/drawingml/2006/picture">
+                  <pic:nvPicPr>
+                    <pic:cNvPr id="1122397012" name="Imagen 1" descr="Calle de ciudad con edificios altos&#10;&#10;El contenido generado por IA puede ser incorrecto."/>
+                    <pic:cNvPicPr/>
+                  </pic:nvPicPr>
+                  <pic:blipFill>
+                    <a:blip r:embed="rId15"/>
+                    <a:stretch>
+                      <a:fillRect/>
+                    </a:stretch>
+                  </pic:blipFill>
+                  <pic:spPr>
+                    <a:xfrm>
+                      <a:off x="0" y="0"/>
+                      <a:ext cx="5400040" cy="5066665"/>
+                    </a:xfrm>
+                    <a:prstGeom prst="rect">
+                      <a:avLst/>
+                    </a:prstGeom>
+                  </pic:spPr>
+                </pic:pic>
+              </a:graphicData>
+            </a:graphic>
+          </wp:inline>
+        </w:drawing>
+      </w:r>
+      <w:r>
+        <w:t>5. Figura con caption</w:t>
+      </w:r>
     </w:p>
     <w:p>
       <w:r>
@@ -608,15 +650,7 @@
     </w:p>
     <w:p>
       <w:r>
-        <w:t xml:space="preserve">Clase </w:t>
-      </w:r>
-      <w:proofErr w:type="spellStart"/>
-      <w:r>
-        <w:t>img</w:t>
-      </w:r>
-      <w:proofErr w:type="spellEnd"/>
-      <w:r>
-        <w:t>-fluid</w:t>
+        <w:t>Clase img-fluid</w:t>
       </w:r>
     </w:p>
     <w:p>
@@ -625,61 +659,69 @@
       </w:r>
     </w:p>
     <w:p>
-      <w:proofErr w:type="spellStart"/>
-      <w:r>
-        <w:t>Caption</w:t>
-      </w:r>
-      <w:proofErr w:type="spellEnd"/>
-      <w:r>
-        <w:t xml:space="preserve"> centrado</w:t>
-      </w:r>
-    </w:p>
-    <w:p>
-      <w:r>
-        <w:t xml:space="preserve">Captura 9 – Figura con </w:t>
-      </w:r>
-      <w:proofErr w:type="spellStart"/>
-      <w:r>
-        <w:t>caption</w:t>
-      </w:r>
-      <w:proofErr w:type="spellEnd"/>
+      <w:r>
+        <w:t>Caption centrado</w:t>
+      </w:r>
+    </w:p>
+    <w:p>
+      <w:r>
+        <w:t>Captura 9 – Figura con caption</w:t>
+      </w:r>
     </w:p>
     <w:p>
       <w:r>
         <w:rPr>
-          <w:rFonts w:ascii="Segoe UI Emoji" w:hAnsi="Segoe UI Emoji" w:cs="Segoe UI Emoji"/>
+          <w:noProof/>
         </w:rPr>
-        <w:t>👉</w:t>
-      </w:r>
-      <w:r>
-        <w:t xml:space="preserve"> Inserta aquí la captura de la quinta fila.</w:t>
-      </w:r>
-    </w:p>
-    <w:p>
+        <w:lastRenderedPageBreak/>
+        <w:drawing>
+          <wp:inline distT="0" distB="0" distL="0" distR="0" wp14:anchorId="4A1029D1" wp14:editId="71212B51">
+            <wp:extent cx="5400040" cy="4893310"/>
+            <wp:effectExtent l="0" t="0" r="0" b="2540"/>
+            <wp:docPr id="597205578" name="Imagen 1" descr="Una imagen de una ciudad&#10;&#10;El contenido generado por IA puede ser incorrecto."/>
+            <wp:cNvGraphicFramePr>
+              <a:graphicFrameLocks xmlns:a="http://schemas.openxmlformats.org/drawingml/2006/main" noChangeAspect="1"/>
+            </wp:cNvGraphicFramePr>
+            <a:graphic xmlns:a="http://schemas.openxmlformats.org/drawingml/2006/main">
+              <a:graphicData uri="http://schemas.openxmlformats.org/drawingml/2006/picture">
+                <pic:pic xmlns:pic="http://schemas.openxmlformats.org/drawingml/2006/picture">
+                  <pic:nvPicPr>
+                    <pic:cNvPr id="597205578" name="Imagen 1" descr="Una imagen de una ciudad&#10;&#10;El contenido generado por IA puede ser incorrecto."/>
+                    <pic:cNvPicPr/>
+                  </pic:nvPicPr>
+                  <pic:blipFill>
+                    <a:blip r:embed="rId16"/>
+                    <a:stretch>
+                      <a:fillRect/>
+                    </a:stretch>
+                  </pic:blipFill>
+                  <pic:spPr>
+                    <a:xfrm>
+                      <a:off x="0" y="0"/>
+                      <a:ext cx="5400040" cy="4893310"/>
+                    </a:xfrm>
+                    <a:prstGeom prst="rect">
+                      <a:avLst/>
+                    </a:prstGeom>
+                  </pic:spPr>
+                </pic:pic>
+              </a:graphicData>
+            </a:graphic>
+          </wp:inline>
+        </w:drawing>
+      </w:r>
       <w:r>
         <w:t>6. Comportamiento responsive</w:t>
       </w:r>
     </w:p>
     <w:p>
       <w:r>
-        <w:lastRenderedPageBreak/>
         <w:t>Se ha comprobado el comportamiento de las imágenes en pantallas pequeñas (por ejemplo, 580px). Las imágenes se adaptan al ancho disponible manteniendo su proporción.</w:t>
       </w:r>
     </w:p>
     <w:p>
       <w:r>
         <w:t>Captura 10 – Vista a 580px de ancho</w:t>
-      </w:r>
-    </w:p>
-    <w:p>
-      <w:r>
-        <w:rPr>
-          <w:rFonts w:ascii="Segoe UI Emoji" w:hAnsi="Segoe UI Emoji" w:cs="Segoe UI Emoji"/>
-        </w:rPr>
-        <w:t>👉</w:t>
-      </w:r>
-      <w:r>
-        <w:t xml:space="preserve"> Inserta aquí la captura del navegador reducido.</w:t>
       </w:r>
     </w:p>
     <w:p>
@@ -690,6 +732,47 @@
           <w:szCs w:val="30"/>
         </w:rPr>
       </w:pPr>
+      <w:r>
+        <w:rPr>
+          <w:noProof/>
+        </w:rPr>
+        <w:lastRenderedPageBreak/>
+        <w:drawing>
+          <wp:inline distT="0" distB="0" distL="0" distR="0" wp14:anchorId="748E655A" wp14:editId="52E34BD1">
+            <wp:extent cx="1724025" cy="6548622"/>
+            <wp:effectExtent l="0" t="0" r="0" b="5080"/>
+            <wp:docPr id="1549102647" name="Imagen 1" descr="Imagen que contiene refrigerador&#10;&#10;El contenido generado por IA puede ser incorrecto."/>
+            <wp:cNvGraphicFramePr>
+              <a:graphicFrameLocks xmlns:a="http://schemas.openxmlformats.org/drawingml/2006/main" noChangeAspect="1"/>
+            </wp:cNvGraphicFramePr>
+            <a:graphic xmlns:a="http://schemas.openxmlformats.org/drawingml/2006/main">
+              <a:graphicData uri="http://schemas.openxmlformats.org/drawingml/2006/picture">
+                <pic:pic xmlns:pic="http://schemas.openxmlformats.org/drawingml/2006/picture">
+                  <pic:nvPicPr>
+                    <pic:cNvPr id="1549102647" name="Imagen 1" descr="Imagen que contiene refrigerador&#10;&#10;El contenido generado por IA puede ser incorrecto."/>
+                    <pic:cNvPicPr/>
+                  </pic:nvPicPr>
+                  <pic:blipFill>
+                    <a:blip r:embed="rId17"/>
+                    <a:stretch>
+                      <a:fillRect/>
+                    </a:stretch>
+                  </pic:blipFill>
+                  <pic:spPr>
+                    <a:xfrm>
+                      <a:off x="0" y="0"/>
+                      <a:ext cx="1724582" cy="6550738"/>
+                    </a:xfrm>
+                    <a:prstGeom prst="rect">
+                      <a:avLst/>
+                    </a:prstGeom>
+                  </pic:spPr>
+                </pic:pic>
+              </a:graphicData>
+            </a:graphic>
+          </wp:inline>
+        </w:drawing>
+      </w:r>
     </w:p>
     <w:p>
       <w:pPr>
@@ -705,304 +788,498 @@
           <w:sz w:val="30"/>
           <w:szCs w:val="30"/>
         </w:rPr>
+        <w:t>RESULTADO FINAL:</w:t>
+      </w:r>
+    </w:p>
+    <w:p>
+      <w:pPr>
+        <w:rPr>
+          <w:rFonts w:ascii="Aptos Black" w:hAnsi="Aptos Black"/>
+          <w:sz w:val="30"/>
+          <w:szCs w:val="30"/>
+        </w:rPr>
+      </w:pPr>
+      <w:r>
+        <w:rPr>
+          <w:noProof/>
+        </w:rPr>
+        <w:lastRenderedPageBreak/>
+        <w:drawing>
+          <wp:inline distT="0" distB="0" distL="0" distR="0" wp14:anchorId="7BACBE3F" wp14:editId="3B4D4C18">
+            <wp:extent cx="4821555" cy="8892540"/>
+            <wp:effectExtent l="0" t="0" r="0" b="3810"/>
+            <wp:docPr id="2088612663" name="Imagen 1" descr="Imagen que contiene foto, gato, diferente, cama&#10;&#10;El contenido generado por IA puede ser incorrecto."/>
+            <wp:cNvGraphicFramePr>
+              <a:graphicFrameLocks xmlns:a="http://schemas.openxmlformats.org/drawingml/2006/main" noChangeAspect="1"/>
+            </wp:cNvGraphicFramePr>
+            <a:graphic xmlns:a="http://schemas.openxmlformats.org/drawingml/2006/main">
+              <a:graphicData uri="http://schemas.openxmlformats.org/drawingml/2006/picture">
+                <pic:pic xmlns:pic="http://schemas.openxmlformats.org/drawingml/2006/picture">
+                  <pic:nvPicPr>
+                    <pic:cNvPr id="2088612663" name="Imagen 1" descr="Imagen que contiene foto, gato, diferente, cama&#10;&#10;El contenido generado por IA puede ser incorrecto."/>
+                    <pic:cNvPicPr/>
+                  </pic:nvPicPr>
+                  <pic:blipFill>
+                    <a:blip r:embed="rId18"/>
+                    <a:stretch>
+                      <a:fillRect/>
+                    </a:stretch>
+                  </pic:blipFill>
+                  <pic:spPr>
+                    <a:xfrm>
+                      <a:off x="0" y="0"/>
+                      <a:ext cx="4821555" cy="8892540"/>
+                    </a:xfrm>
+                    <a:prstGeom prst="rect">
+                      <a:avLst/>
+                    </a:prstGeom>
+                  </pic:spPr>
+                </pic:pic>
+              </a:graphicData>
+            </a:graphic>
+          </wp:inline>
+        </w:drawing>
+      </w:r>
+    </w:p>
+    <w:p>
+      <w:pPr>
+        <w:rPr>
+          <w:rFonts w:ascii="Aptos Black" w:hAnsi="Aptos Black"/>
+          <w:b/>
+          <w:bCs/>
+          <w:sz w:val="30"/>
+          <w:szCs w:val="30"/>
+        </w:rPr>
+      </w:pPr>
+      <w:r>
+        <w:rPr>
+          <w:rFonts w:ascii="Aptos Black" w:hAnsi="Aptos Black"/>
+          <w:b/>
+          <w:bCs/>
+          <w:sz w:val="30"/>
+          <w:szCs w:val="30"/>
+        </w:rPr>
+        <w:lastRenderedPageBreak/>
         <w:t>ACTIVIDAD 3 – Tablas con Bootstrap</w:t>
       </w:r>
     </w:p>
     <w:p>
       <w:r>
-        <w:t>1. Tabla con clase table-</w:t>
-      </w:r>
-      <w:proofErr w:type="spellStart"/>
-      <w:r>
-        <w:t>dark</w:t>
-      </w:r>
-      <w:proofErr w:type="spellEnd"/>
-    </w:p>
-    <w:p>
-      <w:r>
-        <w:t>En la primera fila se ha creado una tabla básica de Bootstrap y se le ha aplicado la clase:</w:t>
-      </w:r>
-    </w:p>
-    <w:p>
-      <w:r>
-        <w:t>Código</w:t>
-      </w:r>
-    </w:p>
-    <w:p>
-      <w:r>
-        <w:t>table table-</w:t>
-      </w:r>
-      <w:proofErr w:type="spellStart"/>
-      <w:r>
-        <w:t>dark</w:t>
-      </w:r>
-      <w:proofErr w:type="spellEnd"/>
-    </w:p>
-    <w:p>
-      <w:r>
-        <w:t>Esta clase transforma toda la tabla a un estilo oscuro, incluyendo cabecera, filas y bordes. El objetivo es observar cómo Bootstrap aplica un tema completo de color sin necesidad de CSS adicional.</w:t>
-      </w:r>
-    </w:p>
-    <w:p>
-      <w:r>
-        <w:t>(No requiere captura porque ya la hiciste previamente.)</w:t>
-      </w:r>
-    </w:p>
-    <w:p>
-      <w:r>
-        <w:t>2. Tabla con clase table-responsive-</w:t>
-      </w:r>
-      <w:proofErr w:type="spellStart"/>
-      <w:r>
-        <w:t>md</w:t>
-      </w:r>
-      <w:proofErr w:type="spellEnd"/>
-      <w:r>
-        <w:t xml:space="preserve"> y 10 columnas</w:t>
-      </w:r>
-    </w:p>
-    <w:p>
-      <w:r>
-        <w:t>En la segunda fila se ha replicado la tabla anterior, sustituyendo la clase table-</w:t>
-      </w:r>
-      <w:proofErr w:type="spellStart"/>
-      <w:r>
-        <w:t>dark</w:t>
-      </w:r>
-      <w:proofErr w:type="spellEnd"/>
-      <w:r>
-        <w:t xml:space="preserve"> por:</w:t>
-      </w:r>
-    </w:p>
-    <w:p>
-      <w:r>
-        <w:t>Código</w:t>
-      </w:r>
-    </w:p>
-    <w:p>
-      <w:r>
-        <w:t>table-responsive-</w:t>
-      </w:r>
-      <w:proofErr w:type="spellStart"/>
-      <w:r>
-        <w:t>md</w:t>
-      </w:r>
-      <w:proofErr w:type="spellEnd"/>
-    </w:p>
-    <w:p>
-      <w:r>
-        <w:t>Además, se han añadido 10 columnas en la cabecera (Campo #1 … Campo #10) para comprobar cómo se comporta la tabla cuando el contenido es demasiado ancho.</w:t>
-      </w:r>
-    </w:p>
-    <w:p>
-      <w:r>
-        <w:t>En pantallas medianas o superiores (≥768px), la tabla se muestra completa.</w:t>
-      </w:r>
-    </w:p>
-    <w:p>
-      <w:r>
-        <w:t xml:space="preserve">En pantallas pequeñas aparece un </w:t>
-      </w:r>
-      <w:proofErr w:type="spellStart"/>
-      <w:r>
-        <w:t>scroll</w:t>
-      </w:r>
-      <w:proofErr w:type="spellEnd"/>
-      <w:r>
-        <w:t xml:space="preserve"> horizontal, permitiendo ver todas las columnas sin romper el diseño.</w:t>
-      </w:r>
-    </w:p>
-    <w:p>
+        <w:t>1. Tabla con clase table-dark</w:t>
+      </w:r>
+    </w:p>
+    <w:p>
+      <w:r>
+        <w:t>En la primera fila se ha creado una tabla básica utilizando las clases estándar de Bootstrap. A esta tabla se le ha añadido la clase:</w:t>
+      </w:r>
+    </w:p>
+    <w:p>
+      <w:r>
+        <w:t>table table-dark</w:t>
+      </w:r>
+    </w:p>
+    <w:p>
+      <w:r>
+        <w:t>Esta clase transforma toda la tabla a un estilo oscuro:</w:t>
+      </w:r>
+    </w:p>
+    <w:p>
+      <w:r>
+        <w:t>La cabecera aparece con fondo oscuro y texto claro.</w:t>
+      </w:r>
+    </w:p>
+    <w:p>
+      <w:r>
+        <w:t>Las filas y bordes adoptan el mismo tema oscuro.</w:t>
+      </w:r>
+    </w:p>
+    <w:p>
+      <w:r>
+        <w:t>No es necesario añadir CSS adicional, ya que Bootstrap aplica automáticamente el estilo completo.</w:t>
+      </w:r>
+    </w:p>
+    <w:p>
+      <w:r>
+        <w:t>El objetivo de esta parte es comprobar cómo Bootstrap permite cambiar el aspecto global de una tabla con una sola clase.</w:t>
+      </w:r>
+    </w:p>
+    <w:p>
+      <w:r>
+        <w:t>Captura 11 – Tabla con clase table-dark</w:t>
+      </w:r>
+    </w:p>
+    <w:p>
+      <w:r>
+        <w:rPr>
+          <w:noProof/>
+        </w:rPr>
+        <w:drawing>
+          <wp:inline distT="0" distB="0" distL="0" distR="0" wp14:anchorId="74A9154C" wp14:editId="45F99AA4">
+            <wp:extent cx="5400040" cy="1183005"/>
+            <wp:effectExtent l="0" t="0" r="0" b="0"/>
+            <wp:docPr id="497796137" name="Imagen 1" descr="Captura de pantalla de un celular&#10;&#10;El contenido generado por IA puede ser incorrecto."/>
+            <wp:cNvGraphicFramePr>
+              <a:graphicFrameLocks xmlns:a="http://schemas.openxmlformats.org/drawingml/2006/main" noChangeAspect="1"/>
+            </wp:cNvGraphicFramePr>
+            <a:graphic xmlns:a="http://schemas.openxmlformats.org/drawingml/2006/main">
+              <a:graphicData uri="http://schemas.openxmlformats.org/drawingml/2006/picture">
+                <pic:pic xmlns:pic="http://schemas.openxmlformats.org/drawingml/2006/picture">
+                  <pic:nvPicPr>
+                    <pic:cNvPr id="497796137" name="Imagen 1" descr="Captura de pantalla de un celular&#10;&#10;El contenido generado por IA puede ser incorrecto."/>
+                    <pic:cNvPicPr/>
+                  </pic:nvPicPr>
+                  <pic:blipFill>
+                    <a:blip r:embed="rId19"/>
+                    <a:stretch>
+                      <a:fillRect/>
+                    </a:stretch>
+                  </pic:blipFill>
+                  <pic:spPr>
+                    <a:xfrm>
+                      <a:off x="0" y="0"/>
+                      <a:ext cx="5400040" cy="1183005"/>
+                    </a:xfrm>
+                    <a:prstGeom prst="rect">
+                      <a:avLst/>
+                    </a:prstGeom>
+                  </pic:spPr>
+                </pic:pic>
+              </a:graphicData>
+            </a:graphic>
+          </wp:inline>
+        </w:drawing>
+      </w:r>
+      <w:r>
+        <w:t>2. Tabla con clase table-responsive-md y 10 columnas</w:t>
+      </w:r>
+    </w:p>
+    <w:p>
+      <w:r>
+        <w:t>En la segunda fila se ha replicado la tabla anterior, pero sustituyendo la clase table-dark por:</w:t>
+      </w:r>
+    </w:p>
+    <w:p>
+      <w:r>
+        <w:t>table-responsive-md</w:t>
+      </w:r>
+    </w:p>
+    <w:p>
+      <w:r>
+        <w:t>Además, se han añadido 10 columnas en la cabecera (Campo #1 … Campo #10) para observar el comportamiento de la tabla cuando el contenido es demasiado ancho.</w:t>
+      </w:r>
+    </w:p>
+    <w:p>
+      <w:r>
+        <w:t>El comportamiento es el siguiente:</w:t>
+      </w:r>
+    </w:p>
+    <w:p>
+      <w:r>
+        <w:t>En pantallas medianas o grandes (≥768px): La tabla se muestra completa sin necesidad de desplazamiento.</w:t>
+      </w:r>
+    </w:p>
+    <w:p>
+      <w:r>
+        <w:t>En pantallas pequeñas: Bootstrap activa automáticamente un scroll horizontal, permitiendo visualizar todas las columnas sin romper el diseño.</w:t>
+      </w:r>
+    </w:p>
+    <w:p>
+      <w:r>
+        <w:t>Esta prueba permite comprobar la utilidad de las tablas responsive cuando se trabaja con grandes cantidades de datos.</w:t>
+      </w:r>
+    </w:p>
+    <w:p>
+      <w:r>
+        <w:lastRenderedPageBreak/>
+        <w:t>Captura 12 – Tabla responsive con 10 columnas</w:t>
+      </w:r>
+    </w:p>
+    <w:p>
+      <w:r>
+        <w:rPr>
+          <w:noProof/>
+        </w:rPr>
+        <w:drawing>
+          <wp:inline distT="0" distB="0" distL="0" distR="0" wp14:anchorId="4818DE3E" wp14:editId="5BBAFB8E">
+            <wp:extent cx="5400040" cy="1104265"/>
+            <wp:effectExtent l="0" t="0" r="0" b="635"/>
+            <wp:docPr id="960439284" name="Imagen 1"/>
+            <wp:cNvGraphicFramePr>
+              <a:graphicFrameLocks xmlns:a="http://schemas.openxmlformats.org/drawingml/2006/main" noChangeAspect="1"/>
+            </wp:cNvGraphicFramePr>
+            <a:graphic xmlns:a="http://schemas.openxmlformats.org/drawingml/2006/main">
+              <a:graphicData uri="http://schemas.openxmlformats.org/drawingml/2006/picture">
+                <pic:pic xmlns:pic="http://schemas.openxmlformats.org/drawingml/2006/picture">
+                  <pic:nvPicPr>
+                    <pic:cNvPr id="960439284" name=""/>
+                    <pic:cNvPicPr/>
+                  </pic:nvPicPr>
+                  <pic:blipFill>
+                    <a:blip r:embed="rId20"/>
+                    <a:stretch>
+                      <a:fillRect/>
+                    </a:stretch>
+                  </pic:blipFill>
+                  <pic:spPr>
+                    <a:xfrm>
+                      <a:off x="0" y="0"/>
+                      <a:ext cx="5400040" cy="1104265"/>
+                    </a:xfrm>
+                    <a:prstGeom prst="rect">
+                      <a:avLst/>
+                    </a:prstGeom>
+                  </pic:spPr>
+                </pic:pic>
+              </a:graphicData>
+            </a:graphic>
+          </wp:inline>
+        </w:drawing>
+      </w:r>
       <w:r>
         <w:t>3. Tabla con clases de color y significado</w:t>
       </w:r>
     </w:p>
     <w:p>
       <w:r>
-        <w:t>En la tercera fila se ha replicado la tabla inicial y se han probado diferentes clases de color, tanto generales (</w:t>
-      </w:r>
-      <w:proofErr w:type="spellStart"/>
-      <w:r>
-        <w:t>bg</w:t>
-      </w:r>
-      <w:proofErr w:type="spellEnd"/>
-      <w:r>
-        <w:t>-*) como específicas de tablas (table-*):</w:t>
-      </w:r>
-    </w:p>
-    <w:p>
-      <w:proofErr w:type="gramStart"/>
-      <w:r>
-        <w:t>.table</w:t>
-      </w:r>
-      <w:proofErr w:type="gramEnd"/>
-      <w:r>
-        <w:t>-active</w:t>
+        <w:t>En la tercera fila se ha replicado la tabla inicial y se han probado diferentes clases de color, tanto generales como específicas de tablas:</w:t>
+      </w:r>
+    </w:p>
+    <w:p>
+      <w:r>
+        <w:t>Clases generales de fondo (bg-*):</w:t>
+      </w:r>
+    </w:p>
+    <w:p>
+      <w:r>
+        <w:t>.bg-danger</w:t>
+      </w:r>
+    </w:p>
+    <w:p>
+      <w:r>
+        <w:t>.bg-info</w:t>
+      </w:r>
+    </w:p>
+    <w:p>
+      <w:r>
+        <w:t>.bg-primary</w:t>
+      </w:r>
+    </w:p>
+    <w:p>
+      <w:r>
+        <w:t>.bg-success</w:t>
+      </w:r>
+    </w:p>
+    <w:p>
+      <w:r>
+        <w:t>.bg-warning</w:t>
+      </w:r>
+    </w:p>
+    <w:p>
+      <w:r>
+        <w:t>Estas clases aplican color únicamente al fondo del elemento, sin modificar bordes ni estilos de tabla.</w:t>
+      </w:r>
+    </w:p>
+    <w:p>
+      <w:r>
+        <w:t>Clases específicas de tabla (table-*):</w:t>
+      </w:r>
+    </w:p>
+    <w:p>
+      <w:r>
+        <w:t>.table-active</w:t>
+      </w:r>
+    </w:p>
+    <w:p>
+      <w:r>
+        <w:t>.table-danger</w:t>
+      </w:r>
+    </w:p>
+    <w:p>
+      <w:r>
+        <w:t>.table-info</w:t>
+      </w:r>
+    </w:p>
+    <w:p>
+      <w:r>
+        <w:t>.table-success</w:t>
+      </w:r>
+    </w:p>
+    <w:p>
+      <w:r>
+        <w:t>.table-warning</w:t>
+      </w:r>
+    </w:p>
+    <w:p>
+      <w:r>
+        <w:t>Estas clases están diseñadas específicamente para tablas y aplican estilos coherentes con el diseño de Bootstrap:</w:t>
+      </w:r>
+    </w:p>
+    <w:p>
+      <w:r>
+        <w:t>Fondo coloreado</w:t>
+      </w:r>
+    </w:p>
+    <w:p>
+      <w:r>
+        <w:t>Texto adaptado</w:t>
+      </w:r>
+    </w:p>
+    <w:p>
+      <w:r>
+        <w:t>Bordes ajustados</w:t>
+      </w:r>
+    </w:p>
+    <w:p>
+      <w:r>
+        <w:t>Contraste adecuado</w:t>
+      </w:r>
+    </w:p>
+    <w:p>
+      <w:r>
+        <w:t>Configuración final solicitada</w:t>
       </w:r>
     </w:p>
     <w:p>
       <w:r>
         <w:lastRenderedPageBreak/>
-        <w:t>.</w:t>
-      </w:r>
-      <w:proofErr w:type="spellStart"/>
-      <w:r>
-        <w:t>bg-danger</w:t>
-      </w:r>
-      <w:proofErr w:type="spellEnd"/>
-      <w:r>
-        <w:t xml:space="preserve"> </w:t>
-      </w:r>
-      <w:proofErr w:type="gramStart"/>
-      <w:r>
-        <w:t>/ .table</w:t>
-      </w:r>
-      <w:proofErr w:type="gramEnd"/>
-      <w:r>
-        <w:t>-</w:t>
-      </w:r>
-      <w:proofErr w:type="spellStart"/>
-      <w:r>
-        <w:t>danger</w:t>
-      </w:r>
-      <w:proofErr w:type="spellEnd"/>
-    </w:p>
-    <w:p>
-      <w:r>
-        <w:t>.</w:t>
-      </w:r>
-      <w:proofErr w:type="spellStart"/>
-      <w:r>
-        <w:t>bg-info</w:t>
-      </w:r>
-      <w:proofErr w:type="spellEnd"/>
-      <w:r>
-        <w:t xml:space="preserve"> </w:t>
-      </w:r>
-      <w:proofErr w:type="gramStart"/>
-      <w:r>
-        <w:t>/ .table</w:t>
-      </w:r>
-      <w:proofErr w:type="gramEnd"/>
-      <w:r>
-        <w:t>-</w:t>
-      </w:r>
-      <w:proofErr w:type="spellStart"/>
-      <w:r>
-        <w:t>info</w:t>
-      </w:r>
-      <w:proofErr w:type="spellEnd"/>
-    </w:p>
-    <w:p>
-      <w:r>
-        <w:t>.</w:t>
-      </w:r>
-      <w:proofErr w:type="spellStart"/>
-      <w:r>
-        <w:t>bg-primary</w:t>
-      </w:r>
-      <w:proofErr w:type="spellEnd"/>
-    </w:p>
-    <w:p>
-      <w:r>
-        <w:t>.</w:t>
-      </w:r>
-      <w:proofErr w:type="spellStart"/>
-      <w:r>
-        <w:t>bg-success</w:t>
-      </w:r>
-      <w:proofErr w:type="spellEnd"/>
-      <w:r>
-        <w:t xml:space="preserve"> </w:t>
-      </w:r>
-      <w:proofErr w:type="gramStart"/>
-      <w:r>
-        <w:t>/ .table</w:t>
-      </w:r>
-      <w:proofErr w:type="gramEnd"/>
-      <w:r>
-        <w:t>-</w:t>
-      </w:r>
-      <w:proofErr w:type="spellStart"/>
-      <w:r>
-        <w:t>success</w:t>
-      </w:r>
-      <w:proofErr w:type="spellEnd"/>
-    </w:p>
-    <w:p>
-      <w:r>
-        <w:t>.</w:t>
-      </w:r>
-      <w:proofErr w:type="spellStart"/>
-      <w:r>
-        <w:t>bg-</w:t>
-      </w:r>
-      <w:proofErr w:type="gramStart"/>
-      <w:r>
-        <w:t>warning</w:t>
-      </w:r>
-      <w:proofErr w:type="spellEnd"/>
-      <w:proofErr w:type="gramEnd"/>
-      <w:r>
-        <w:t xml:space="preserve"> </w:t>
-      </w:r>
-      <w:proofErr w:type="gramStart"/>
-      <w:r>
-        <w:t>/ .table</w:t>
-      </w:r>
-      <w:proofErr w:type="gramEnd"/>
-      <w:r>
-        <w:t>-</w:t>
-      </w:r>
-      <w:proofErr w:type="spellStart"/>
-      <w:proofErr w:type="gramStart"/>
-      <w:r>
-        <w:t>warning</w:t>
-      </w:r>
-      <w:proofErr w:type="spellEnd"/>
-      <w:proofErr w:type="gramEnd"/>
-    </w:p>
-    <w:p>
-      <w:r>
-        <w:t>Finalmente, se ha dejado la tabla con:</w:t>
-      </w:r>
-    </w:p>
-    <w:p>
-      <w:r>
-        <w:t>Primera fila: clase table-</w:t>
-      </w:r>
-      <w:proofErr w:type="spellStart"/>
-      <w:r>
-        <w:t>success</w:t>
-      </w:r>
-      <w:proofErr w:type="spellEnd"/>
-    </w:p>
-    <w:p>
-      <w:r>
-        <w:t xml:space="preserve">Segunda fila: clase </w:t>
-      </w:r>
-      <w:proofErr w:type="spellStart"/>
-      <w:r>
-        <w:t>bg-primary</w:t>
-      </w:r>
-      <w:proofErr w:type="spellEnd"/>
-    </w:p>
-    <w:p>
-      <w:r>
-        <w:t>Esto permite observar la diferencia entre usar clases específicas de tabla (table-*) y clases generales de fondo (</w:t>
-      </w:r>
-      <w:proofErr w:type="spellStart"/>
-      <w:r>
-        <w:t>bg</w:t>
-      </w:r>
-      <w:proofErr w:type="spellEnd"/>
-      <w:r>
-        <w:t>-*).</w:t>
-      </w:r>
-    </w:p>
-    <w:p/>
+        <w:t>La tabla se ha dejado con la siguiente configuración:</w:t>
+      </w:r>
+    </w:p>
+    <w:p>
+      <w:r>
+        <w:t>Primera fila: clase table-success → Fondo verde claro con estilo específico de tabla.</w:t>
+      </w:r>
+    </w:p>
+    <w:p>
+      <w:r>
+        <w:t>Segunda fila: clase bg-primary → Fondo azul intenso, aplicado como clase general de fondo.</w:t>
+      </w:r>
+    </w:p>
+    <w:p>
+      <w:r>
+        <w:t>Esto permite comparar visualmente:</w:t>
+      </w:r>
+    </w:p>
+    <w:p>
+      <w:r>
+        <w:t>Cómo se ve una fila con estilo específico de tabla (table-success)</w:t>
+      </w:r>
+    </w:p>
+    <w:p>
+      <w:r>
+        <w:t>Cómo se ve una fila con un color general (bg-primary)</w:t>
+      </w:r>
+    </w:p>
+    <w:p>
+      <w:r>
+        <w:t>Captura 13 – Tabla con clases de color y significado</w:t>
+      </w:r>
+    </w:p>
+    <w:p>
+      <w:r>
+        <w:rPr>
+          <w:noProof/>
+        </w:rPr>
+        <w:drawing>
+          <wp:inline distT="0" distB="0" distL="0" distR="0" wp14:anchorId="219C06B8" wp14:editId="0ADEFE56">
+            <wp:extent cx="5400040" cy="1938655"/>
+            <wp:effectExtent l="0" t="0" r="0" b="4445"/>
+            <wp:docPr id="258104791" name="Imagen 1"/>
+            <wp:cNvGraphicFramePr>
+              <a:graphicFrameLocks xmlns:a="http://schemas.openxmlformats.org/drawingml/2006/main" noChangeAspect="1"/>
+            </wp:cNvGraphicFramePr>
+            <a:graphic xmlns:a="http://schemas.openxmlformats.org/drawingml/2006/main">
+              <a:graphicData uri="http://schemas.openxmlformats.org/drawingml/2006/picture">
+                <pic:pic xmlns:pic="http://schemas.openxmlformats.org/drawingml/2006/picture">
+                  <pic:nvPicPr>
+                    <pic:cNvPr id="258104791" name=""/>
+                    <pic:cNvPicPr/>
+                  </pic:nvPicPr>
+                  <pic:blipFill>
+                    <a:blip r:embed="rId21"/>
+                    <a:stretch>
+                      <a:fillRect/>
+                    </a:stretch>
+                  </pic:blipFill>
+                  <pic:spPr>
+                    <a:xfrm>
+                      <a:off x="0" y="0"/>
+                      <a:ext cx="5400040" cy="1938655"/>
+                    </a:xfrm>
+                    <a:prstGeom prst="rect">
+                      <a:avLst/>
+                    </a:prstGeom>
+                  </pic:spPr>
+                </pic:pic>
+              </a:graphicData>
+            </a:graphic>
+          </wp:inline>
+        </w:drawing>
+      </w:r>
+    </w:p>
+    <w:p>
+      <w:pPr>
+        <w:rPr>
+          <w:rFonts w:ascii="Aptos Black" w:hAnsi="Aptos Black"/>
+        </w:rPr>
+      </w:pPr>
+      <w:r>
+        <w:rPr>
+          <w:rFonts w:ascii="Aptos Black" w:hAnsi="Aptos Black"/>
+        </w:rPr>
+        <w:t>RESULTADO FINAL:</w:t>
+      </w:r>
+    </w:p>
+    <w:p>
+      <w:pPr>
+        <w:rPr>
+          <w:rFonts w:ascii="Aptos Black" w:hAnsi="Aptos Black"/>
+        </w:rPr>
+      </w:pPr>
+      <w:r>
+        <w:rPr>
+          <w:noProof/>
+        </w:rPr>
+        <w:lastRenderedPageBreak/>
+        <w:drawing>
+          <wp:inline distT="0" distB="0" distL="0" distR="0" wp14:anchorId="7B521BF5" wp14:editId="2202C090">
+            <wp:extent cx="5400040" cy="4381500"/>
+            <wp:effectExtent l="0" t="0" r="0" b="0"/>
+            <wp:docPr id="1435110729" name="Imagen 1" descr="Interfaz de usuario gráfica, Tabla&#10;&#10;El contenido generado por IA puede ser incorrecto."/>
+            <wp:cNvGraphicFramePr>
+              <a:graphicFrameLocks xmlns:a="http://schemas.openxmlformats.org/drawingml/2006/main" noChangeAspect="1"/>
+            </wp:cNvGraphicFramePr>
+            <a:graphic xmlns:a="http://schemas.openxmlformats.org/drawingml/2006/main">
+              <a:graphicData uri="http://schemas.openxmlformats.org/drawingml/2006/picture">
+                <pic:pic xmlns:pic="http://schemas.openxmlformats.org/drawingml/2006/picture">
+                  <pic:nvPicPr>
+                    <pic:cNvPr id="1435110729" name="Imagen 1" descr="Interfaz de usuario gráfica, Tabla&#10;&#10;El contenido generado por IA puede ser incorrecto."/>
+                    <pic:cNvPicPr/>
+                  </pic:nvPicPr>
+                  <pic:blipFill>
+                    <a:blip r:embed="rId22"/>
+                    <a:stretch>
+                      <a:fillRect/>
+                    </a:stretch>
+                  </pic:blipFill>
+                  <pic:spPr>
+                    <a:xfrm>
+                      <a:off x="0" y="0"/>
+                      <a:ext cx="5400040" cy="4381500"/>
+                    </a:xfrm>
+                    <a:prstGeom prst="rect">
+                      <a:avLst/>
+                    </a:prstGeom>
+                  </pic:spPr>
+                </pic:pic>
+              </a:graphicData>
+            </a:graphic>
+          </wp:inline>
+        </w:drawing>
+      </w:r>
+    </w:p>
     <w:sectPr>
-      <w:headerReference w:type="default" r:id="rId12"/>
+      <w:headerReference w:type="default" r:id="rId23"/>
       <w:pgSz w:w="11906" w:h="16838"/>
       <w:pgMar w:top="1417" w:right="1701" w:bottom="1417" w:left="1701" w:header="708" w:footer="708" w:gutter="0"/>
       <w:cols w:space="708"/>
@@ -1090,6 +1367,304 @@
 <file path=word/numbering.xml><?xml version="1.0" encoding="utf-8"?>
 <w:numbering xmlns:wpc="http://schemas.microsoft.com/office/word/2010/wordprocessingCanvas" xmlns:cx="http://schemas.microsoft.com/office/drawing/2014/chartex" xmlns:cx1="http://schemas.microsoft.com/office/drawing/2015/9/8/chartex" xmlns:cx2="http://schemas.microsoft.com/office/drawing/2015/10/21/chartex" xmlns:cx3="http://schemas.microsoft.com/office/drawing/2016/5/9/chartex" xmlns:cx4="http://schemas.microsoft.com/office/drawing/2016/5/10/chartex" xmlns:cx5="http://schemas.microsoft.com/office/drawing/2016/5/11/chartex" xmlns:cx6="http://schemas.microsoft.com/office/drawing/2016/5/12/chartex" xmlns:cx7="http://schemas.microsoft.com/office/drawing/2016/5/13/chartex" xmlns:cx8="http://schemas.microsoft.com/office/drawing/2016/5/14/chartex" xmlns:mc="http://schemas.openxmlformats.org/markup-compatibility/2006" xmlns:aink="http://schemas.microsoft.com/office/drawing/2016/ink" xmlns:am3d="http://schemas.microsoft.com/office/drawing/2017/model3d" xmlns:o="urn:schemas-microsoft-com:office:office" xmlns:oel="http://schemas.microsoft.com/office/2019/extlst" xmlns:r="http://schemas.openxmlformats.org/officeDocument/2006/relationships" xmlns:m="http://schemas.openxmlformats.org/officeDocument/2006/math" xmlns:v="urn:schemas-microsoft-com:vml" xmlns:wp14="http://schemas.microsoft.com/office/word/2010/wordprocessingDrawing" xmlns:wp="http://schemas.openxmlformats.org/drawingml/2006/wordprocessingDrawing" xmlns:w10="urn:schemas-microsoft-com:office:word" xmlns:w="http://schemas.openxmlformats.org/wordprocessingml/2006/main" xmlns:w14="http://schemas.microsoft.com/office/word/2010/wordml" xmlns:w15="http://schemas.microsoft.com/office/word/2012/wordml" xmlns:w16cex="http://schemas.microsoft.com/office/word/2018/wordml/cex" xmlns:w16cid="http://schemas.microsoft.com/office/word/2016/wordml/cid" xmlns:w16="http://schemas.microsoft.com/office/word/2018/wordml" xmlns:w16du="http://schemas.microsoft.com/office/word/2023/wordml/word16du" xmlns:w16sdtdh="http://schemas.microsoft.com/office/word/2020/wordml/sdtdatahash" xmlns:w16sdtfl="http://schemas.microsoft.com/office/word/2024/wordml/sdtformatlock" xmlns:w16se="http://schemas.microsoft.com/office/word/2015/wordml/symex" xmlns:wpg="http://schemas.microsoft.com/office/word/2010/wordprocessingGroup" xmlns:wpi="http://schemas.microsoft.com/office/word/2010/wordprocessingInk" xmlns:wne="http://schemas.microsoft.com/office/word/2006/wordml" xmlns:wps="http://schemas.microsoft.com/office/word/2010/wordprocessingShape" mc:Ignorable="w14 w15 w16se w16cid w16 w16cex w16sdtdh w16sdtfl w16du wp14">
   <w:abstractNum w:abstractNumId="0" w15:restartNumberingAfterBreak="0">
+    <w:nsid w:val="08416588"/>
+    <w:multiLevelType w:val="multilevel"/>
+    <w:tmpl w:val="BB2CF6E6"/>
+    <w:lvl w:ilvl="0">
+      <w:start w:val="1"/>
+      <w:numFmt w:val="bullet"/>
+      <w:lvlText w:val=""/>
+      <w:lvlJc w:val="left"/>
+      <w:pPr>
+        <w:tabs>
+          <w:tab w:val="num" w:pos="720"/>
+        </w:tabs>
+        <w:ind w:left="720" w:hanging="360"/>
+      </w:pPr>
+      <w:rPr>
+        <w:rFonts w:ascii="Symbol" w:hAnsi="Symbol" w:hint="default"/>
+        <w:sz w:val="20"/>
+      </w:rPr>
+    </w:lvl>
+    <w:lvl w:ilvl="1" w:tentative="1">
+      <w:start w:val="1"/>
+      <w:numFmt w:val="bullet"/>
+      <w:lvlText w:val="o"/>
+      <w:lvlJc w:val="left"/>
+      <w:pPr>
+        <w:tabs>
+          <w:tab w:val="num" w:pos="1440"/>
+        </w:tabs>
+        <w:ind w:left="1440" w:hanging="360"/>
+      </w:pPr>
+      <w:rPr>
+        <w:rFonts w:ascii="Courier New" w:hAnsi="Courier New" w:hint="default"/>
+        <w:sz w:val="20"/>
+      </w:rPr>
+    </w:lvl>
+    <w:lvl w:ilvl="2" w:tentative="1">
+      <w:start w:val="1"/>
+      <w:numFmt w:val="bullet"/>
+      <w:lvlText w:val=""/>
+      <w:lvlJc w:val="left"/>
+      <w:pPr>
+        <w:tabs>
+          <w:tab w:val="num" w:pos="2160"/>
+        </w:tabs>
+        <w:ind w:left="2160" w:hanging="360"/>
+      </w:pPr>
+      <w:rPr>
+        <w:rFonts w:ascii="Wingdings" w:hAnsi="Wingdings" w:hint="default"/>
+        <w:sz w:val="20"/>
+      </w:rPr>
+    </w:lvl>
+    <w:lvl w:ilvl="3" w:tentative="1">
+      <w:start w:val="1"/>
+      <w:numFmt w:val="bullet"/>
+      <w:lvlText w:val=""/>
+      <w:lvlJc w:val="left"/>
+      <w:pPr>
+        <w:tabs>
+          <w:tab w:val="num" w:pos="2880"/>
+        </w:tabs>
+        <w:ind w:left="2880" w:hanging="360"/>
+      </w:pPr>
+      <w:rPr>
+        <w:rFonts w:ascii="Wingdings" w:hAnsi="Wingdings" w:hint="default"/>
+        <w:sz w:val="20"/>
+      </w:rPr>
+    </w:lvl>
+    <w:lvl w:ilvl="4" w:tentative="1">
+      <w:start w:val="1"/>
+      <w:numFmt w:val="bullet"/>
+      <w:lvlText w:val=""/>
+      <w:lvlJc w:val="left"/>
+      <w:pPr>
+        <w:tabs>
+          <w:tab w:val="num" w:pos="3600"/>
+        </w:tabs>
+        <w:ind w:left="3600" w:hanging="360"/>
+      </w:pPr>
+      <w:rPr>
+        <w:rFonts w:ascii="Wingdings" w:hAnsi="Wingdings" w:hint="default"/>
+        <w:sz w:val="20"/>
+      </w:rPr>
+    </w:lvl>
+    <w:lvl w:ilvl="5" w:tentative="1">
+      <w:start w:val="1"/>
+      <w:numFmt w:val="bullet"/>
+      <w:lvlText w:val=""/>
+      <w:lvlJc w:val="left"/>
+      <w:pPr>
+        <w:tabs>
+          <w:tab w:val="num" w:pos="4320"/>
+        </w:tabs>
+        <w:ind w:left="4320" w:hanging="360"/>
+      </w:pPr>
+      <w:rPr>
+        <w:rFonts w:ascii="Wingdings" w:hAnsi="Wingdings" w:hint="default"/>
+        <w:sz w:val="20"/>
+      </w:rPr>
+    </w:lvl>
+    <w:lvl w:ilvl="6" w:tentative="1">
+      <w:start w:val="1"/>
+      <w:numFmt w:val="bullet"/>
+      <w:lvlText w:val=""/>
+      <w:lvlJc w:val="left"/>
+      <w:pPr>
+        <w:tabs>
+          <w:tab w:val="num" w:pos="5040"/>
+        </w:tabs>
+        <w:ind w:left="5040" w:hanging="360"/>
+      </w:pPr>
+      <w:rPr>
+        <w:rFonts w:ascii="Wingdings" w:hAnsi="Wingdings" w:hint="default"/>
+        <w:sz w:val="20"/>
+      </w:rPr>
+    </w:lvl>
+    <w:lvl w:ilvl="7" w:tentative="1">
+      <w:start w:val="1"/>
+      <w:numFmt w:val="bullet"/>
+      <w:lvlText w:val=""/>
+      <w:lvlJc w:val="left"/>
+      <w:pPr>
+        <w:tabs>
+          <w:tab w:val="num" w:pos="5760"/>
+        </w:tabs>
+        <w:ind w:left="5760" w:hanging="360"/>
+      </w:pPr>
+      <w:rPr>
+        <w:rFonts w:ascii="Wingdings" w:hAnsi="Wingdings" w:hint="default"/>
+        <w:sz w:val="20"/>
+      </w:rPr>
+    </w:lvl>
+    <w:lvl w:ilvl="8" w:tentative="1">
+      <w:start w:val="1"/>
+      <w:numFmt w:val="bullet"/>
+      <w:lvlText w:val=""/>
+      <w:lvlJc w:val="left"/>
+      <w:pPr>
+        <w:tabs>
+          <w:tab w:val="num" w:pos="6480"/>
+        </w:tabs>
+        <w:ind w:left="6480" w:hanging="360"/>
+      </w:pPr>
+      <w:rPr>
+        <w:rFonts w:ascii="Wingdings" w:hAnsi="Wingdings" w:hint="default"/>
+        <w:sz w:val="20"/>
+      </w:rPr>
+    </w:lvl>
+  </w:abstractNum>
+  <w:abstractNum w:abstractNumId="1" w15:restartNumberingAfterBreak="0">
+    <w:nsid w:val="0AE17A9E"/>
+    <w:multiLevelType w:val="multilevel"/>
+    <w:tmpl w:val="A6B89304"/>
+    <w:lvl w:ilvl="0">
+      <w:start w:val="1"/>
+      <w:numFmt w:val="bullet"/>
+      <w:lvlText w:val=""/>
+      <w:lvlJc w:val="left"/>
+      <w:pPr>
+        <w:tabs>
+          <w:tab w:val="num" w:pos="720"/>
+        </w:tabs>
+        <w:ind w:left="720" w:hanging="360"/>
+      </w:pPr>
+      <w:rPr>
+        <w:rFonts w:ascii="Symbol" w:hAnsi="Symbol" w:hint="default"/>
+        <w:sz w:val="20"/>
+      </w:rPr>
+    </w:lvl>
+    <w:lvl w:ilvl="1" w:tentative="1">
+      <w:start w:val="1"/>
+      <w:numFmt w:val="bullet"/>
+      <w:lvlText w:val="o"/>
+      <w:lvlJc w:val="left"/>
+      <w:pPr>
+        <w:tabs>
+          <w:tab w:val="num" w:pos="1440"/>
+        </w:tabs>
+        <w:ind w:left="1440" w:hanging="360"/>
+      </w:pPr>
+      <w:rPr>
+        <w:rFonts w:ascii="Courier New" w:hAnsi="Courier New" w:hint="default"/>
+        <w:sz w:val="20"/>
+      </w:rPr>
+    </w:lvl>
+    <w:lvl w:ilvl="2" w:tentative="1">
+      <w:start w:val="1"/>
+      <w:numFmt w:val="bullet"/>
+      <w:lvlText w:val=""/>
+      <w:lvlJc w:val="left"/>
+      <w:pPr>
+        <w:tabs>
+          <w:tab w:val="num" w:pos="2160"/>
+        </w:tabs>
+        <w:ind w:left="2160" w:hanging="360"/>
+      </w:pPr>
+      <w:rPr>
+        <w:rFonts w:ascii="Wingdings" w:hAnsi="Wingdings" w:hint="default"/>
+        <w:sz w:val="20"/>
+      </w:rPr>
+    </w:lvl>
+    <w:lvl w:ilvl="3" w:tentative="1">
+      <w:start w:val="1"/>
+      <w:numFmt w:val="bullet"/>
+      <w:lvlText w:val=""/>
+      <w:lvlJc w:val="left"/>
+      <w:pPr>
+        <w:tabs>
+          <w:tab w:val="num" w:pos="2880"/>
+        </w:tabs>
+        <w:ind w:left="2880" w:hanging="360"/>
+      </w:pPr>
+      <w:rPr>
+        <w:rFonts w:ascii="Wingdings" w:hAnsi="Wingdings" w:hint="default"/>
+        <w:sz w:val="20"/>
+      </w:rPr>
+    </w:lvl>
+    <w:lvl w:ilvl="4" w:tentative="1">
+      <w:start w:val="1"/>
+      <w:numFmt w:val="bullet"/>
+      <w:lvlText w:val=""/>
+      <w:lvlJc w:val="left"/>
+      <w:pPr>
+        <w:tabs>
+          <w:tab w:val="num" w:pos="3600"/>
+        </w:tabs>
+        <w:ind w:left="3600" w:hanging="360"/>
+      </w:pPr>
+      <w:rPr>
+        <w:rFonts w:ascii="Wingdings" w:hAnsi="Wingdings" w:hint="default"/>
+        <w:sz w:val="20"/>
+      </w:rPr>
+    </w:lvl>
+    <w:lvl w:ilvl="5" w:tentative="1">
+      <w:start w:val="1"/>
+      <w:numFmt w:val="bullet"/>
+      <w:lvlText w:val=""/>
+      <w:lvlJc w:val="left"/>
+      <w:pPr>
+        <w:tabs>
+          <w:tab w:val="num" w:pos="4320"/>
+        </w:tabs>
+        <w:ind w:left="4320" w:hanging="360"/>
+      </w:pPr>
+      <w:rPr>
+        <w:rFonts w:ascii="Wingdings" w:hAnsi="Wingdings" w:hint="default"/>
+        <w:sz w:val="20"/>
+      </w:rPr>
+    </w:lvl>
+    <w:lvl w:ilvl="6" w:tentative="1">
+      <w:start w:val="1"/>
+      <w:numFmt w:val="bullet"/>
+      <w:lvlText w:val=""/>
+      <w:lvlJc w:val="left"/>
+      <w:pPr>
+        <w:tabs>
+          <w:tab w:val="num" w:pos="5040"/>
+        </w:tabs>
+        <w:ind w:left="5040" w:hanging="360"/>
+      </w:pPr>
+      <w:rPr>
+        <w:rFonts w:ascii="Wingdings" w:hAnsi="Wingdings" w:hint="default"/>
+        <w:sz w:val="20"/>
+      </w:rPr>
+    </w:lvl>
+    <w:lvl w:ilvl="7" w:tentative="1">
+      <w:start w:val="1"/>
+      <w:numFmt w:val="bullet"/>
+      <w:lvlText w:val=""/>
+      <w:lvlJc w:val="left"/>
+      <w:pPr>
+        <w:tabs>
+          <w:tab w:val="num" w:pos="5760"/>
+        </w:tabs>
+        <w:ind w:left="5760" w:hanging="360"/>
+      </w:pPr>
+      <w:rPr>
+        <w:rFonts w:ascii="Wingdings" w:hAnsi="Wingdings" w:hint="default"/>
+        <w:sz w:val="20"/>
+      </w:rPr>
+    </w:lvl>
+    <w:lvl w:ilvl="8" w:tentative="1">
+      <w:start w:val="1"/>
+      <w:numFmt w:val="bullet"/>
+      <w:lvlText w:val=""/>
+      <w:lvlJc w:val="left"/>
+      <w:pPr>
+        <w:tabs>
+          <w:tab w:val="num" w:pos="6480"/>
+        </w:tabs>
+        <w:ind w:left="6480" w:hanging="360"/>
+      </w:pPr>
+      <w:rPr>
+        <w:rFonts w:ascii="Wingdings" w:hAnsi="Wingdings" w:hint="default"/>
+        <w:sz w:val="20"/>
+      </w:rPr>
+    </w:lvl>
+  </w:abstractNum>
+  <w:abstractNum w:abstractNumId="2" w15:restartNumberingAfterBreak="0">
     <w:nsid w:val="0DDB4C4F"/>
     <w:multiLevelType w:val="multilevel"/>
     <w:tmpl w:val="911A0484"/>
@@ -1238,7 +1813,156 @@
       </w:rPr>
     </w:lvl>
   </w:abstractNum>
-  <w:abstractNum w:abstractNumId="1" w15:restartNumberingAfterBreak="0">
+  <w:abstractNum w:abstractNumId="3" w15:restartNumberingAfterBreak="0">
+    <w:nsid w:val="0DEE1129"/>
+    <w:multiLevelType w:val="multilevel"/>
+    <w:tmpl w:val="FDA444F8"/>
+    <w:lvl w:ilvl="0">
+      <w:start w:val="1"/>
+      <w:numFmt w:val="bullet"/>
+      <w:lvlText w:val=""/>
+      <w:lvlJc w:val="left"/>
+      <w:pPr>
+        <w:tabs>
+          <w:tab w:val="num" w:pos="720"/>
+        </w:tabs>
+        <w:ind w:left="720" w:hanging="360"/>
+      </w:pPr>
+      <w:rPr>
+        <w:rFonts w:ascii="Symbol" w:hAnsi="Symbol" w:hint="default"/>
+        <w:sz w:val="20"/>
+      </w:rPr>
+    </w:lvl>
+    <w:lvl w:ilvl="1" w:tentative="1">
+      <w:start w:val="1"/>
+      <w:numFmt w:val="bullet"/>
+      <w:lvlText w:val="o"/>
+      <w:lvlJc w:val="left"/>
+      <w:pPr>
+        <w:tabs>
+          <w:tab w:val="num" w:pos="1440"/>
+        </w:tabs>
+        <w:ind w:left="1440" w:hanging="360"/>
+      </w:pPr>
+      <w:rPr>
+        <w:rFonts w:ascii="Courier New" w:hAnsi="Courier New" w:hint="default"/>
+        <w:sz w:val="20"/>
+      </w:rPr>
+    </w:lvl>
+    <w:lvl w:ilvl="2" w:tentative="1">
+      <w:start w:val="1"/>
+      <w:numFmt w:val="bullet"/>
+      <w:lvlText w:val=""/>
+      <w:lvlJc w:val="left"/>
+      <w:pPr>
+        <w:tabs>
+          <w:tab w:val="num" w:pos="2160"/>
+        </w:tabs>
+        <w:ind w:left="2160" w:hanging="360"/>
+      </w:pPr>
+      <w:rPr>
+        <w:rFonts w:ascii="Wingdings" w:hAnsi="Wingdings" w:hint="default"/>
+        <w:sz w:val="20"/>
+      </w:rPr>
+    </w:lvl>
+    <w:lvl w:ilvl="3" w:tentative="1">
+      <w:start w:val="1"/>
+      <w:numFmt w:val="bullet"/>
+      <w:lvlText w:val=""/>
+      <w:lvlJc w:val="left"/>
+      <w:pPr>
+        <w:tabs>
+          <w:tab w:val="num" w:pos="2880"/>
+        </w:tabs>
+        <w:ind w:left="2880" w:hanging="360"/>
+      </w:pPr>
+      <w:rPr>
+        <w:rFonts w:ascii="Wingdings" w:hAnsi="Wingdings" w:hint="default"/>
+        <w:sz w:val="20"/>
+      </w:rPr>
+    </w:lvl>
+    <w:lvl w:ilvl="4" w:tentative="1">
+      <w:start w:val="1"/>
+      <w:numFmt w:val="bullet"/>
+      <w:lvlText w:val=""/>
+      <w:lvlJc w:val="left"/>
+      <w:pPr>
+        <w:tabs>
+          <w:tab w:val="num" w:pos="3600"/>
+        </w:tabs>
+        <w:ind w:left="3600" w:hanging="360"/>
+      </w:pPr>
+      <w:rPr>
+        <w:rFonts w:ascii="Wingdings" w:hAnsi="Wingdings" w:hint="default"/>
+        <w:sz w:val="20"/>
+      </w:rPr>
+    </w:lvl>
+    <w:lvl w:ilvl="5" w:tentative="1">
+      <w:start w:val="1"/>
+      <w:numFmt w:val="bullet"/>
+      <w:lvlText w:val=""/>
+      <w:lvlJc w:val="left"/>
+      <w:pPr>
+        <w:tabs>
+          <w:tab w:val="num" w:pos="4320"/>
+        </w:tabs>
+        <w:ind w:left="4320" w:hanging="360"/>
+      </w:pPr>
+      <w:rPr>
+        <w:rFonts w:ascii="Wingdings" w:hAnsi="Wingdings" w:hint="default"/>
+        <w:sz w:val="20"/>
+      </w:rPr>
+    </w:lvl>
+    <w:lvl w:ilvl="6" w:tentative="1">
+      <w:start w:val="1"/>
+      <w:numFmt w:val="bullet"/>
+      <w:lvlText w:val=""/>
+      <w:lvlJc w:val="left"/>
+      <w:pPr>
+        <w:tabs>
+          <w:tab w:val="num" w:pos="5040"/>
+        </w:tabs>
+        <w:ind w:left="5040" w:hanging="360"/>
+      </w:pPr>
+      <w:rPr>
+        <w:rFonts w:ascii="Wingdings" w:hAnsi="Wingdings" w:hint="default"/>
+        <w:sz w:val="20"/>
+      </w:rPr>
+    </w:lvl>
+    <w:lvl w:ilvl="7" w:tentative="1">
+      <w:start w:val="1"/>
+      <w:numFmt w:val="bullet"/>
+      <w:lvlText w:val=""/>
+      <w:lvlJc w:val="left"/>
+      <w:pPr>
+        <w:tabs>
+          <w:tab w:val="num" w:pos="5760"/>
+        </w:tabs>
+        <w:ind w:left="5760" w:hanging="360"/>
+      </w:pPr>
+      <w:rPr>
+        <w:rFonts w:ascii="Wingdings" w:hAnsi="Wingdings" w:hint="default"/>
+        <w:sz w:val="20"/>
+      </w:rPr>
+    </w:lvl>
+    <w:lvl w:ilvl="8" w:tentative="1">
+      <w:start w:val="1"/>
+      <w:numFmt w:val="bullet"/>
+      <w:lvlText w:val=""/>
+      <w:lvlJc w:val="left"/>
+      <w:pPr>
+        <w:tabs>
+          <w:tab w:val="num" w:pos="6480"/>
+        </w:tabs>
+        <w:ind w:left="6480" w:hanging="360"/>
+      </w:pPr>
+      <w:rPr>
+        <w:rFonts w:ascii="Wingdings" w:hAnsi="Wingdings" w:hint="default"/>
+        <w:sz w:val="20"/>
+      </w:rPr>
+    </w:lvl>
+  </w:abstractNum>
+  <w:abstractNum w:abstractNumId="4" w15:restartNumberingAfterBreak="0">
     <w:nsid w:val="21AD11FF"/>
     <w:multiLevelType w:val="multilevel"/>
     <w:tmpl w:val="3320B9EE"/>
@@ -1387,7 +2111,7 @@
       </w:rPr>
     </w:lvl>
   </w:abstractNum>
-  <w:abstractNum w:abstractNumId="2" w15:restartNumberingAfterBreak="0">
+  <w:abstractNum w:abstractNumId="5" w15:restartNumberingAfterBreak="0">
     <w:nsid w:val="285331B1"/>
     <w:multiLevelType w:val="multilevel"/>
     <w:tmpl w:val="4078CFAC"/>
@@ -1536,7 +2260,7 @@
       </w:rPr>
     </w:lvl>
   </w:abstractNum>
-  <w:abstractNum w:abstractNumId="3" w15:restartNumberingAfterBreak="0">
+  <w:abstractNum w:abstractNumId="6" w15:restartNumberingAfterBreak="0">
     <w:nsid w:val="401F15DD"/>
     <w:multiLevelType w:val="multilevel"/>
     <w:tmpl w:val="C70C9138"/>
@@ -1685,7 +2409,7 @@
       </w:rPr>
     </w:lvl>
   </w:abstractNum>
-  <w:abstractNum w:abstractNumId="4" w15:restartNumberingAfterBreak="0">
+  <w:abstractNum w:abstractNumId="7" w15:restartNumberingAfterBreak="0">
     <w:nsid w:val="48AA5F87"/>
     <w:multiLevelType w:val="multilevel"/>
     <w:tmpl w:val="11486CB8"/>
@@ -1834,7 +2558,7 @@
       </w:rPr>
     </w:lvl>
   </w:abstractNum>
-  <w:abstractNum w:abstractNumId="5" w15:restartNumberingAfterBreak="0">
+  <w:abstractNum w:abstractNumId="8" w15:restartNumberingAfterBreak="0">
     <w:nsid w:val="4CEB1981"/>
     <w:multiLevelType w:val="multilevel"/>
     <w:tmpl w:val="391067C4"/>
@@ -1983,7 +2707,454 @@
       </w:rPr>
     </w:lvl>
   </w:abstractNum>
-  <w:abstractNum w:abstractNumId="6" w15:restartNumberingAfterBreak="0">
+  <w:abstractNum w:abstractNumId="9" w15:restartNumberingAfterBreak="0">
+    <w:nsid w:val="582375D2"/>
+    <w:multiLevelType w:val="multilevel"/>
+    <w:tmpl w:val="9DE85CAC"/>
+    <w:lvl w:ilvl="0">
+      <w:start w:val="1"/>
+      <w:numFmt w:val="bullet"/>
+      <w:lvlText w:val=""/>
+      <w:lvlJc w:val="left"/>
+      <w:pPr>
+        <w:tabs>
+          <w:tab w:val="num" w:pos="720"/>
+        </w:tabs>
+        <w:ind w:left="720" w:hanging="360"/>
+      </w:pPr>
+      <w:rPr>
+        <w:rFonts w:ascii="Symbol" w:hAnsi="Symbol" w:hint="default"/>
+        <w:sz w:val="20"/>
+      </w:rPr>
+    </w:lvl>
+    <w:lvl w:ilvl="1" w:tentative="1">
+      <w:start w:val="1"/>
+      <w:numFmt w:val="bullet"/>
+      <w:lvlText w:val="o"/>
+      <w:lvlJc w:val="left"/>
+      <w:pPr>
+        <w:tabs>
+          <w:tab w:val="num" w:pos="1440"/>
+        </w:tabs>
+        <w:ind w:left="1440" w:hanging="360"/>
+      </w:pPr>
+      <w:rPr>
+        <w:rFonts w:ascii="Courier New" w:hAnsi="Courier New" w:hint="default"/>
+        <w:sz w:val="20"/>
+      </w:rPr>
+    </w:lvl>
+    <w:lvl w:ilvl="2" w:tentative="1">
+      <w:start w:val="1"/>
+      <w:numFmt w:val="bullet"/>
+      <w:lvlText w:val=""/>
+      <w:lvlJc w:val="left"/>
+      <w:pPr>
+        <w:tabs>
+          <w:tab w:val="num" w:pos="2160"/>
+        </w:tabs>
+        <w:ind w:left="2160" w:hanging="360"/>
+      </w:pPr>
+      <w:rPr>
+        <w:rFonts w:ascii="Wingdings" w:hAnsi="Wingdings" w:hint="default"/>
+        <w:sz w:val="20"/>
+      </w:rPr>
+    </w:lvl>
+    <w:lvl w:ilvl="3" w:tentative="1">
+      <w:start w:val="1"/>
+      <w:numFmt w:val="bullet"/>
+      <w:lvlText w:val=""/>
+      <w:lvlJc w:val="left"/>
+      <w:pPr>
+        <w:tabs>
+          <w:tab w:val="num" w:pos="2880"/>
+        </w:tabs>
+        <w:ind w:left="2880" w:hanging="360"/>
+      </w:pPr>
+      <w:rPr>
+        <w:rFonts w:ascii="Wingdings" w:hAnsi="Wingdings" w:hint="default"/>
+        <w:sz w:val="20"/>
+      </w:rPr>
+    </w:lvl>
+    <w:lvl w:ilvl="4" w:tentative="1">
+      <w:start w:val="1"/>
+      <w:numFmt w:val="bullet"/>
+      <w:lvlText w:val=""/>
+      <w:lvlJc w:val="left"/>
+      <w:pPr>
+        <w:tabs>
+          <w:tab w:val="num" w:pos="3600"/>
+        </w:tabs>
+        <w:ind w:left="3600" w:hanging="360"/>
+      </w:pPr>
+      <w:rPr>
+        <w:rFonts w:ascii="Wingdings" w:hAnsi="Wingdings" w:hint="default"/>
+        <w:sz w:val="20"/>
+      </w:rPr>
+    </w:lvl>
+    <w:lvl w:ilvl="5" w:tentative="1">
+      <w:start w:val="1"/>
+      <w:numFmt w:val="bullet"/>
+      <w:lvlText w:val=""/>
+      <w:lvlJc w:val="left"/>
+      <w:pPr>
+        <w:tabs>
+          <w:tab w:val="num" w:pos="4320"/>
+        </w:tabs>
+        <w:ind w:left="4320" w:hanging="360"/>
+      </w:pPr>
+      <w:rPr>
+        <w:rFonts w:ascii="Wingdings" w:hAnsi="Wingdings" w:hint="default"/>
+        <w:sz w:val="20"/>
+      </w:rPr>
+    </w:lvl>
+    <w:lvl w:ilvl="6" w:tentative="1">
+      <w:start w:val="1"/>
+      <w:numFmt w:val="bullet"/>
+      <w:lvlText w:val=""/>
+      <w:lvlJc w:val="left"/>
+      <w:pPr>
+        <w:tabs>
+          <w:tab w:val="num" w:pos="5040"/>
+        </w:tabs>
+        <w:ind w:left="5040" w:hanging="360"/>
+      </w:pPr>
+      <w:rPr>
+        <w:rFonts w:ascii="Wingdings" w:hAnsi="Wingdings" w:hint="default"/>
+        <w:sz w:val="20"/>
+      </w:rPr>
+    </w:lvl>
+    <w:lvl w:ilvl="7" w:tentative="1">
+      <w:start w:val="1"/>
+      <w:numFmt w:val="bullet"/>
+      <w:lvlText w:val=""/>
+      <w:lvlJc w:val="left"/>
+      <w:pPr>
+        <w:tabs>
+          <w:tab w:val="num" w:pos="5760"/>
+        </w:tabs>
+        <w:ind w:left="5760" w:hanging="360"/>
+      </w:pPr>
+      <w:rPr>
+        <w:rFonts w:ascii="Wingdings" w:hAnsi="Wingdings" w:hint="default"/>
+        <w:sz w:val="20"/>
+      </w:rPr>
+    </w:lvl>
+    <w:lvl w:ilvl="8" w:tentative="1">
+      <w:start w:val="1"/>
+      <w:numFmt w:val="bullet"/>
+      <w:lvlText w:val=""/>
+      <w:lvlJc w:val="left"/>
+      <w:pPr>
+        <w:tabs>
+          <w:tab w:val="num" w:pos="6480"/>
+        </w:tabs>
+        <w:ind w:left="6480" w:hanging="360"/>
+      </w:pPr>
+      <w:rPr>
+        <w:rFonts w:ascii="Wingdings" w:hAnsi="Wingdings" w:hint="default"/>
+        <w:sz w:val="20"/>
+      </w:rPr>
+    </w:lvl>
+  </w:abstractNum>
+  <w:abstractNum w:abstractNumId="10" w15:restartNumberingAfterBreak="0">
+    <w:nsid w:val="602B0C21"/>
+    <w:multiLevelType w:val="multilevel"/>
+    <w:tmpl w:val="10CCC90C"/>
+    <w:lvl w:ilvl="0">
+      <w:start w:val="1"/>
+      <w:numFmt w:val="bullet"/>
+      <w:lvlText w:val=""/>
+      <w:lvlJc w:val="left"/>
+      <w:pPr>
+        <w:tabs>
+          <w:tab w:val="num" w:pos="720"/>
+        </w:tabs>
+        <w:ind w:left="720" w:hanging="360"/>
+      </w:pPr>
+      <w:rPr>
+        <w:rFonts w:ascii="Symbol" w:hAnsi="Symbol" w:hint="default"/>
+        <w:sz w:val="20"/>
+      </w:rPr>
+    </w:lvl>
+    <w:lvl w:ilvl="1" w:tentative="1">
+      <w:start w:val="1"/>
+      <w:numFmt w:val="bullet"/>
+      <w:lvlText w:val="o"/>
+      <w:lvlJc w:val="left"/>
+      <w:pPr>
+        <w:tabs>
+          <w:tab w:val="num" w:pos="1440"/>
+        </w:tabs>
+        <w:ind w:left="1440" w:hanging="360"/>
+      </w:pPr>
+      <w:rPr>
+        <w:rFonts w:ascii="Courier New" w:hAnsi="Courier New" w:hint="default"/>
+        <w:sz w:val="20"/>
+      </w:rPr>
+    </w:lvl>
+    <w:lvl w:ilvl="2" w:tentative="1">
+      <w:start w:val="1"/>
+      <w:numFmt w:val="bullet"/>
+      <w:lvlText w:val=""/>
+      <w:lvlJc w:val="left"/>
+      <w:pPr>
+        <w:tabs>
+          <w:tab w:val="num" w:pos="2160"/>
+        </w:tabs>
+        <w:ind w:left="2160" w:hanging="360"/>
+      </w:pPr>
+      <w:rPr>
+        <w:rFonts w:ascii="Wingdings" w:hAnsi="Wingdings" w:hint="default"/>
+        <w:sz w:val="20"/>
+      </w:rPr>
+    </w:lvl>
+    <w:lvl w:ilvl="3" w:tentative="1">
+      <w:start w:val="1"/>
+      <w:numFmt w:val="bullet"/>
+      <w:lvlText w:val=""/>
+      <w:lvlJc w:val="left"/>
+      <w:pPr>
+        <w:tabs>
+          <w:tab w:val="num" w:pos="2880"/>
+        </w:tabs>
+        <w:ind w:left="2880" w:hanging="360"/>
+      </w:pPr>
+      <w:rPr>
+        <w:rFonts w:ascii="Wingdings" w:hAnsi="Wingdings" w:hint="default"/>
+        <w:sz w:val="20"/>
+      </w:rPr>
+    </w:lvl>
+    <w:lvl w:ilvl="4" w:tentative="1">
+      <w:start w:val="1"/>
+      <w:numFmt w:val="bullet"/>
+      <w:lvlText w:val=""/>
+      <w:lvlJc w:val="left"/>
+      <w:pPr>
+        <w:tabs>
+          <w:tab w:val="num" w:pos="3600"/>
+        </w:tabs>
+        <w:ind w:left="3600" w:hanging="360"/>
+      </w:pPr>
+      <w:rPr>
+        <w:rFonts w:ascii="Wingdings" w:hAnsi="Wingdings" w:hint="default"/>
+        <w:sz w:val="20"/>
+      </w:rPr>
+    </w:lvl>
+    <w:lvl w:ilvl="5" w:tentative="1">
+      <w:start w:val="1"/>
+      <w:numFmt w:val="bullet"/>
+      <w:lvlText w:val=""/>
+      <w:lvlJc w:val="left"/>
+      <w:pPr>
+        <w:tabs>
+          <w:tab w:val="num" w:pos="4320"/>
+        </w:tabs>
+        <w:ind w:left="4320" w:hanging="360"/>
+      </w:pPr>
+      <w:rPr>
+        <w:rFonts w:ascii="Wingdings" w:hAnsi="Wingdings" w:hint="default"/>
+        <w:sz w:val="20"/>
+      </w:rPr>
+    </w:lvl>
+    <w:lvl w:ilvl="6" w:tentative="1">
+      <w:start w:val="1"/>
+      <w:numFmt w:val="bullet"/>
+      <w:lvlText w:val=""/>
+      <w:lvlJc w:val="left"/>
+      <w:pPr>
+        <w:tabs>
+          <w:tab w:val="num" w:pos="5040"/>
+        </w:tabs>
+        <w:ind w:left="5040" w:hanging="360"/>
+      </w:pPr>
+      <w:rPr>
+        <w:rFonts w:ascii="Wingdings" w:hAnsi="Wingdings" w:hint="default"/>
+        <w:sz w:val="20"/>
+      </w:rPr>
+    </w:lvl>
+    <w:lvl w:ilvl="7" w:tentative="1">
+      <w:start w:val="1"/>
+      <w:numFmt w:val="bullet"/>
+      <w:lvlText w:val=""/>
+      <w:lvlJc w:val="left"/>
+      <w:pPr>
+        <w:tabs>
+          <w:tab w:val="num" w:pos="5760"/>
+        </w:tabs>
+        <w:ind w:left="5760" w:hanging="360"/>
+      </w:pPr>
+      <w:rPr>
+        <w:rFonts w:ascii="Wingdings" w:hAnsi="Wingdings" w:hint="default"/>
+        <w:sz w:val="20"/>
+      </w:rPr>
+    </w:lvl>
+    <w:lvl w:ilvl="8" w:tentative="1">
+      <w:start w:val="1"/>
+      <w:numFmt w:val="bullet"/>
+      <w:lvlText w:val=""/>
+      <w:lvlJc w:val="left"/>
+      <w:pPr>
+        <w:tabs>
+          <w:tab w:val="num" w:pos="6480"/>
+        </w:tabs>
+        <w:ind w:left="6480" w:hanging="360"/>
+      </w:pPr>
+      <w:rPr>
+        <w:rFonts w:ascii="Wingdings" w:hAnsi="Wingdings" w:hint="default"/>
+        <w:sz w:val="20"/>
+      </w:rPr>
+    </w:lvl>
+  </w:abstractNum>
+  <w:abstractNum w:abstractNumId="11" w15:restartNumberingAfterBreak="0">
+    <w:nsid w:val="63C42B44"/>
+    <w:multiLevelType w:val="multilevel"/>
+    <w:tmpl w:val="0ABACD78"/>
+    <w:lvl w:ilvl="0">
+      <w:start w:val="1"/>
+      <w:numFmt w:val="bullet"/>
+      <w:lvlText w:val=""/>
+      <w:lvlJc w:val="left"/>
+      <w:pPr>
+        <w:tabs>
+          <w:tab w:val="num" w:pos="720"/>
+        </w:tabs>
+        <w:ind w:left="720" w:hanging="360"/>
+      </w:pPr>
+      <w:rPr>
+        <w:rFonts w:ascii="Symbol" w:hAnsi="Symbol" w:hint="default"/>
+        <w:sz w:val="20"/>
+      </w:rPr>
+    </w:lvl>
+    <w:lvl w:ilvl="1" w:tentative="1">
+      <w:start w:val="1"/>
+      <w:numFmt w:val="bullet"/>
+      <w:lvlText w:val="o"/>
+      <w:lvlJc w:val="left"/>
+      <w:pPr>
+        <w:tabs>
+          <w:tab w:val="num" w:pos="1440"/>
+        </w:tabs>
+        <w:ind w:left="1440" w:hanging="360"/>
+      </w:pPr>
+      <w:rPr>
+        <w:rFonts w:ascii="Courier New" w:hAnsi="Courier New" w:hint="default"/>
+        <w:sz w:val="20"/>
+      </w:rPr>
+    </w:lvl>
+    <w:lvl w:ilvl="2" w:tentative="1">
+      <w:start w:val="1"/>
+      <w:numFmt w:val="bullet"/>
+      <w:lvlText w:val=""/>
+      <w:lvlJc w:val="left"/>
+      <w:pPr>
+        <w:tabs>
+          <w:tab w:val="num" w:pos="2160"/>
+        </w:tabs>
+        <w:ind w:left="2160" w:hanging="360"/>
+      </w:pPr>
+      <w:rPr>
+        <w:rFonts w:ascii="Wingdings" w:hAnsi="Wingdings" w:hint="default"/>
+        <w:sz w:val="20"/>
+      </w:rPr>
+    </w:lvl>
+    <w:lvl w:ilvl="3" w:tentative="1">
+      <w:start w:val="1"/>
+      <w:numFmt w:val="bullet"/>
+      <w:lvlText w:val=""/>
+      <w:lvlJc w:val="left"/>
+      <w:pPr>
+        <w:tabs>
+          <w:tab w:val="num" w:pos="2880"/>
+        </w:tabs>
+        <w:ind w:left="2880" w:hanging="360"/>
+      </w:pPr>
+      <w:rPr>
+        <w:rFonts w:ascii="Wingdings" w:hAnsi="Wingdings" w:hint="default"/>
+        <w:sz w:val="20"/>
+      </w:rPr>
+    </w:lvl>
+    <w:lvl w:ilvl="4" w:tentative="1">
+      <w:start w:val="1"/>
+      <w:numFmt w:val="bullet"/>
+      <w:lvlText w:val=""/>
+      <w:lvlJc w:val="left"/>
+      <w:pPr>
+        <w:tabs>
+          <w:tab w:val="num" w:pos="3600"/>
+        </w:tabs>
+        <w:ind w:left="3600" w:hanging="360"/>
+      </w:pPr>
+      <w:rPr>
+        <w:rFonts w:ascii="Wingdings" w:hAnsi="Wingdings" w:hint="default"/>
+        <w:sz w:val="20"/>
+      </w:rPr>
+    </w:lvl>
+    <w:lvl w:ilvl="5" w:tentative="1">
+      <w:start w:val="1"/>
+      <w:numFmt w:val="bullet"/>
+      <w:lvlText w:val=""/>
+      <w:lvlJc w:val="left"/>
+      <w:pPr>
+        <w:tabs>
+          <w:tab w:val="num" w:pos="4320"/>
+        </w:tabs>
+        <w:ind w:left="4320" w:hanging="360"/>
+      </w:pPr>
+      <w:rPr>
+        <w:rFonts w:ascii="Wingdings" w:hAnsi="Wingdings" w:hint="default"/>
+        <w:sz w:val="20"/>
+      </w:rPr>
+    </w:lvl>
+    <w:lvl w:ilvl="6" w:tentative="1">
+      <w:start w:val="1"/>
+      <w:numFmt w:val="bullet"/>
+      <w:lvlText w:val=""/>
+      <w:lvlJc w:val="left"/>
+      <w:pPr>
+        <w:tabs>
+          <w:tab w:val="num" w:pos="5040"/>
+        </w:tabs>
+        <w:ind w:left="5040" w:hanging="360"/>
+      </w:pPr>
+      <w:rPr>
+        <w:rFonts w:ascii="Wingdings" w:hAnsi="Wingdings" w:hint="default"/>
+        <w:sz w:val="20"/>
+      </w:rPr>
+    </w:lvl>
+    <w:lvl w:ilvl="7" w:tentative="1">
+      <w:start w:val="1"/>
+      <w:numFmt w:val="bullet"/>
+      <w:lvlText w:val=""/>
+      <w:lvlJc w:val="left"/>
+      <w:pPr>
+        <w:tabs>
+          <w:tab w:val="num" w:pos="5760"/>
+        </w:tabs>
+        <w:ind w:left="5760" w:hanging="360"/>
+      </w:pPr>
+      <w:rPr>
+        <w:rFonts w:ascii="Wingdings" w:hAnsi="Wingdings" w:hint="default"/>
+        <w:sz w:val="20"/>
+      </w:rPr>
+    </w:lvl>
+    <w:lvl w:ilvl="8" w:tentative="1">
+      <w:start w:val="1"/>
+      <w:numFmt w:val="bullet"/>
+      <w:lvlText w:val=""/>
+      <w:lvlJc w:val="left"/>
+      <w:pPr>
+        <w:tabs>
+          <w:tab w:val="num" w:pos="6480"/>
+        </w:tabs>
+        <w:ind w:left="6480" w:hanging="360"/>
+      </w:pPr>
+      <w:rPr>
+        <w:rFonts w:ascii="Wingdings" w:hAnsi="Wingdings" w:hint="default"/>
+        <w:sz w:val="20"/>
+      </w:rPr>
+    </w:lvl>
+  </w:abstractNum>
+  <w:abstractNum w:abstractNumId="12" w15:restartNumberingAfterBreak="0">
     <w:nsid w:val="64531362"/>
     <w:multiLevelType w:val="multilevel"/>
     <w:tmpl w:val="9B4AD620"/>
@@ -2132,7 +3303,7 @@
       </w:rPr>
     </w:lvl>
   </w:abstractNum>
-  <w:abstractNum w:abstractNumId="7" w15:restartNumberingAfterBreak="0">
+  <w:abstractNum w:abstractNumId="13" w15:restartNumberingAfterBreak="0">
     <w:nsid w:val="6A4E0CC4"/>
     <w:multiLevelType w:val="multilevel"/>
     <w:tmpl w:val="D83E73C0"/>
@@ -2281,7 +3452,7 @@
       </w:rPr>
     </w:lvl>
   </w:abstractNum>
-  <w:abstractNum w:abstractNumId="8" w15:restartNumberingAfterBreak="0">
+  <w:abstractNum w:abstractNumId="14" w15:restartNumberingAfterBreak="0">
     <w:nsid w:val="73637C81"/>
     <w:multiLevelType w:val="multilevel"/>
     <w:tmpl w:val="4E6E6AF4"/>
@@ -2430,31 +3601,201 @@
       </w:rPr>
     </w:lvl>
   </w:abstractNum>
+  <w:abstractNum w:abstractNumId="15" w15:restartNumberingAfterBreak="0">
+    <w:nsid w:val="7E9022FB"/>
+    <w:multiLevelType w:val="multilevel"/>
+    <w:tmpl w:val="7F2ACC9E"/>
+    <w:lvl w:ilvl="0">
+      <w:start w:val="1"/>
+      <w:numFmt w:val="bullet"/>
+      <w:lvlText w:val=""/>
+      <w:lvlJc w:val="left"/>
+      <w:pPr>
+        <w:tabs>
+          <w:tab w:val="num" w:pos="720"/>
+        </w:tabs>
+        <w:ind w:left="720" w:hanging="360"/>
+      </w:pPr>
+      <w:rPr>
+        <w:rFonts w:ascii="Symbol" w:hAnsi="Symbol" w:hint="default"/>
+        <w:sz w:val="20"/>
+      </w:rPr>
+    </w:lvl>
+    <w:lvl w:ilvl="1" w:tentative="1">
+      <w:start w:val="1"/>
+      <w:numFmt w:val="bullet"/>
+      <w:lvlText w:val="o"/>
+      <w:lvlJc w:val="left"/>
+      <w:pPr>
+        <w:tabs>
+          <w:tab w:val="num" w:pos="1440"/>
+        </w:tabs>
+        <w:ind w:left="1440" w:hanging="360"/>
+      </w:pPr>
+      <w:rPr>
+        <w:rFonts w:ascii="Courier New" w:hAnsi="Courier New" w:hint="default"/>
+        <w:sz w:val="20"/>
+      </w:rPr>
+    </w:lvl>
+    <w:lvl w:ilvl="2" w:tentative="1">
+      <w:start w:val="1"/>
+      <w:numFmt w:val="bullet"/>
+      <w:lvlText w:val=""/>
+      <w:lvlJc w:val="left"/>
+      <w:pPr>
+        <w:tabs>
+          <w:tab w:val="num" w:pos="2160"/>
+        </w:tabs>
+        <w:ind w:left="2160" w:hanging="360"/>
+      </w:pPr>
+      <w:rPr>
+        <w:rFonts w:ascii="Wingdings" w:hAnsi="Wingdings" w:hint="default"/>
+        <w:sz w:val="20"/>
+      </w:rPr>
+    </w:lvl>
+    <w:lvl w:ilvl="3" w:tentative="1">
+      <w:start w:val="1"/>
+      <w:numFmt w:val="bullet"/>
+      <w:lvlText w:val=""/>
+      <w:lvlJc w:val="left"/>
+      <w:pPr>
+        <w:tabs>
+          <w:tab w:val="num" w:pos="2880"/>
+        </w:tabs>
+        <w:ind w:left="2880" w:hanging="360"/>
+      </w:pPr>
+      <w:rPr>
+        <w:rFonts w:ascii="Wingdings" w:hAnsi="Wingdings" w:hint="default"/>
+        <w:sz w:val="20"/>
+      </w:rPr>
+    </w:lvl>
+    <w:lvl w:ilvl="4" w:tentative="1">
+      <w:start w:val="1"/>
+      <w:numFmt w:val="bullet"/>
+      <w:lvlText w:val=""/>
+      <w:lvlJc w:val="left"/>
+      <w:pPr>
+        <w:tabs>
+          <w:tab w:val="num" w:pos="3600"/>
+        </w:tabs>
+        <w:ind w:left="3600" w:hanging="360"/>
+      </w:pPr>
+      <w:rPr>
+        <w:rFonts w:ascii="Wingdings" w:hAnsi="Wingdings" w:hint="default"/>
+        <w:sz w:val="20"/>
+      </w:rPr>
+    </w:lvl>
+    <w:lvl w:ilvl="5" w:tentative="1">
+      <w:start w:val="1"/>
+      <w:numFmt w:val="bullet"/>
+      <w:lvlText w:val=""/>
+      <w:lvlJc w:val="left"/>
+      <w:pPr>
+        <w:tabs>
+          <w:tab w:val="num" w:pos="4320"/>
+        </w:tabs>
+        <w:ind w:left="4320" w:hanging="360"/>
+      </w:pPr>
+      <w:rPr>
+        <w:rFonts w:ascii="Wingdings" w:hAnsi="Wingdings" w:hint="default"/>
+        <w:sz w:val="20"/>
+      </w:rPr>
+    </w:lvl>
+    <w:lvl w:ilvl="6" w:tentative="1">
+      <w:start w:val="1"/>
+      <w:numFmt w:val="bullet"/>
+      <w:lvlText w:val=""/>
+      <w:lvlJc w:val="left"/>
+      <w:pPr>
+        <w:tabs>
+          <w:tab w:val="num" w:pos="5040"/>
+        </w:tabs>
+        <w:ind w:left="5040" w:hanging="360"/>
+      </w:pPr>
+      <w:rPr>
+        <w:rFonts w:ascii="Wingdings" w:hAnsi="Wingdings" w:hint="default"/>
+        <w:sz w:val="20"/>
+      </w:rPr>
+    </w:lvl>
+    <w:lvl w:ilvl="7" w:tentative="1">
+      <w:start w:val="1"/>
+      <w:numFmt w:val="bullet"/>
+      <w:lvlText w:val=""/>
+      <w:lvlJc w:val="left"/>
+      <w:pPr>
+        <w:tabs>
+          <w:tab w:val="num" w:pos="5760"/>
+        </w:tabs>
+        <w:ind w:left="5760" w:hanging="360"/>
+      </w:pPr>
+      <w:rPr>
+        <w:rFonts w:ascii="Wingdings" w:hAnsi="Wingdings" w:hint="default"/>
+        <w:sz w:val="20"/>
+      </w:rPr>
+    </w:lvl>
+    <w:lvl w:ilvl="8" w:tentative="1">
+      <w:start w:val="1"/>
+      <w:numFmt w:val="bullet"/>
+      <w:lvlText w:val=""/>
+      <w:lvlJc w:val="left"/>
+      <w:pPr>
+        <w:tabs>
+          <w:tab w:val="num" w:pos="6480"/>
+        </w:tabs>
+        <w:ind w:left="6480" w:hanging="360"/>
+      </w:pPr>
+      <w:rPr>
+        <w:rFonts w:ascii="Wingdings" w:hAnsi="Wingdings" w:hint="default"/>
+        <w:sz w:val="20"/>
+      </w:rPr>
+    </w:lvl>
+  </w:abstractNum>
   <w:num w:numId="1" w16cid:durableId="1080254255">
+    <w:abstractNumId w:val="14"/>
+  </w:num>
+  <w:num w:numId="2" w16cid:durableId="681972259">
+    <w:abstractNumId w:val="7"/>
+  </w:num>
+  <w:num w:numId="3" w16cid:durableId="2018195738">
+    <w:abstractNumId w:val="13"/>
+  </w:num>
+  <w:num w:numId="4" w16cid:durableId="553200436">
+    <w:abstractNumId w:val="12"/>
+  </w:num>
+  <w:num w:numId="5" w16cid:durableId="1308823870">
+    <w:abstractNumId w:val="5"/>
+  </w:num>
+  <w:num w:numId="6" w16cid:durableId="684869911">
+    <w:abstractNumId w:val="4"/>
+  </w:num>
+  <w:num w:numId="7" w16cid:durableId="714351726">
     <w:abstractNumId w:val="8"/>
   </w:num>
-  <w:num w:numId="2" w16cid:durableId="681972259">
-    <w:abstractNumId w:val="4"/>
-  </w:num>
-  <w:num w:numId="3" w16cid:durableId="2018195738">
-    <w:abstractNumId w:val="7"/>
-  </w:num>
-  <w:num w:numId="4" w16cid:durableId="553200436">
+  <w:num w:numId="8" w16cid:durableId="1353915410">
     <w:abstractNumId w:val="6"/>
   </w:num>
-  <w:num w:numId="5" w16cid:durableId="1308823870">
+  <w:num w:numId="9" w16cid:durableId="1427313342">
     <w:abstractNumId w:val="2"/>
   </w:num>
-  <w:num w:numId="6" w16cid:durableId="684869911">
+  <w:num w:numId="10" w16cid:durableId="1211193012">
     <w:abstractNumId w:val="1"/>
   </w:num>
-  <w:num w:numId="7" w16cid:durableId="714351726">
-    <w:abstractNumId w:val="5"/>
-  </w:num>
-  <w:num w:numId="8" w16cid:durableId="1353915410">
+  <w:num w:numId="11" w16cid:durableId="679354612">
     <w:abstractNumId w:val="3"/>
   </w:num>
-  <w:num w:numId="9" w16cid:durableId="1427313342">
+  <w:num w:numId="12" w16cid:durableId="180441535">
+    <w:abstractNumId w:val="11"/>
+  </w:num>
+  <w:num w:numId="13" w16cid:durableId="850145069">
+    <w:abstractNumId w:val="10"/>
+  </w:num>
+  <w:num w:numId="14" w16cid:durableId="1043141671">
+    <w:abstractNumId w:val="15"/>
+  </w:num>
+  <w:num w:numId="15" w16cid:durableId="1710497530">
+    <w:abstractNumId w:val="9"/>
+  </w:num>
+  <w:num w:numId="16" w16cid:durableId="869343533">
     <w:abstractNumId w:val="0"/>
   </w:num>
 </w:numbering>

</xml_diff>